<commit_message>
analysing many stock trades and missing values for machine learning
</commit_message>
<xml_diff>
--- a/introduction to machine learning.docx
+++ b/introduction to machine learning.docx
@@ -37,7 +37,6 @@
       <w:r>
         <w:rPr>
           <w:rFonts w:ascii="inherit" w:eastAsia="Times New Roman" w:hAnsi="inherit" w:cs="Courier New"/>
-          <w:noProof/>
           <w:color w:val="E75C58"/>
           <w:sz w:val="21"/>
           <w:szCs w:val="21"/>
@@ -3546,9 +3545,6 @@
     <w:p/>
     <w:p>
       <w:r>
-        <w:rPr>
-          <w:noProof/>
-        </w:rPr>
         <w:drawing>
           <wp:inline distT="0" distB="0" distL="0" distR="0" wp14:anchorId="53CFE1A9" wp14:editId="181AB534">
             <wp:extent cx="5943600" cy="3151505"/>
@@ -3588,9 +3584,6 @@
     </w:p>
     <w:p>
       <w:r>
-        <w:rPr>
-          <w:noProof/>
-        </w:rPr>
         <w:lastRenderedPageBreak/>
         <w:drawing>
           <wp:inline distT="0" distB="0" distL="0" distR="0" wp14:anchorId="42A54331" wp14:editId="4370C2C0">
@@ -3631,9 +3624,6 @@
     </w:p>
     <w:p>
       <w:r>
-        <w:rPr>
-          <w:noProof/>
-        </w:rPr>
         <w:drawing>
           <wp:inline distT="0" distB="0" distL="0" distR="0" wp14:anchorId="2A31BCB8" wp14:editId="351387B3">
             <wp:extent cx="5943600" cy="2407285"/>
@@ -3673,9 +3663,6 @@
     </w:p>
     <w:p>
       <w:r>
-        <w:rPr>
-          <w:noProof/>
-        </w:rPr>
         <w:lastRenderedPageBreak/>
         <w:drawing>
           <wp:inline distT="0" distB="0" distL="0" distR="0" wp14:anchorId="2551CB27" wp14:editId="4DEB4A91">
@@ -3717,9 +3704,6 @@
     <w:p/>
     <w:p>
       <w:r>
-        <w:rPr>
-          <w:noProof/>
-        </w:rPr>
         <w:drawing>
           <wp:inline distT="0" distB="0" distL="0" distR="0" wp14:anchorId="18CBAC34" wp14:editId="575D39A6">
             <wp:extent cx="5943600" cy="2171700"/>
@@ -3759,9 +3743,6 @@
     </w:p>
     <w:p>
       <w:r>
-        <w:rPr>
-          <w:noProof/>
-        </w:rPr>
         <w:lastRenderedPageBreak/>
         <w:drawing>
           <wp:inline distT="0" distB="0" distL="0" distR="0" wp14:anchorId="14866109" wp14:editId="706A7677">
@@ -4240,7 +4221,6 @@
       <w:r>
         <w:rPr>
           <w:rFonts w:eastAsia="Times New Roman" w:cs="Times New Roman"/>
-          <w:noProof/>
         </w:rPr>
         <w:drawing>
           <wp:inline distT="0" distB="0" distL="0" distR="0" wp14:anchorId="40A49257" wp14:editId="048EF41E">
@@ -4402,7 +4382,6 @@
       <w:r>
         <w:rPr>
           <w:rFonts w:ascii="Courier New" w:eastAsia="Times New Roman" w:hAnsi="Courier New" w:cs="Courier New"/>
-          <w:noProof/>
           <w:sz w:val="20"/>
           <w:szCs w:val="20"/>
         </w:rPr>
@@ -4738,7 +4717,6 @@
       <w:r>
         <w:rPr>
           <w:rFonts w:eastAsia="Times New Roman" w:cs="Times New Roman"/>
-          <w:noProof/>
         </w:rPr>
         <w:drawing>
           <wp:inline distT="0" distB="0" distL="0" distR="0" wp14:anchorId="0F25AB1C" wp14:editId="33221CB3">
@@ -5153,9 +5131,6 @@
     <w:p/>
     <w:p>
       <w:r>
-        <w:rPr>
-          <w:noProof/>
-        </w:rPr>
         <w:drawing>
           <wp:inline distT="0" distB="0" distL="0" distR="0" wp14:anchorId="1FA91586" wp14:editId="71C95A73">
             <wp:extent cx="5943600" cy="2948940"/>
@@ -5195,9 +5170,6 @@
     </w:p>
     <w:p>
       <w:r>
-        <w:rPr>
-          <w:noProof/>
-        </w:rPr>
         <w:lastRenderedPageBreak/>
         <w:drawing>
           <wp:inline distT="0" distB="0" distL="0" distR="0" wp14:anchorId="0DDFC728" wp14:editId="26CDA11D">
@@ -5239,9 +5211,6 @@
     <w:p/>
     <w:p>
       <w:r>
-        <w:rPr>
-          <w:noProof/>
-        </w:rPr>
         <w:lastRenderedPageBreak/>
         <w:drawing>
           <wp:inline distT="0" distB="0" distL="0" distR="0" wp14:anchorId="09B13338" wp14:editId="3EA43374">
@@ -6543,9 +6512,6 @@
     </w:p>
     <w:p>
       <w:r>
-        <w:rPr>
-          <w:noProof/>
-        </w:rPr>
         <w:drawing>
           <wp:inline distT="0" distB="0" distL="0" distR="0" wp14:anchorId="2A62DBCF" wp14:editId="6A94BDE7">
             <wp:extent cx="5943600" cy="3246120"/>
@@ -6585,9 +6551,6 @@
     </w:p>
     <w:p>
       <w:r>
-        <w:rPr>
-          <w:noProof/>
-        </w:rPr>
         <w:drawing>
           <wp:inline distT="0" distB="0" distL="0" distR="0" wp14:anchorId="26A9922F" wp14:editId="372E6862">
             <wp:extent cx="5943600" cy="1459230"/>
@@ -6627,9 +6590,6 @@
     </w:p>
     <w:p>
       <w:r>
-        <w:rPr>
-          <w:noProof/>
-        </w:rPr>
         <w:lastRenderedPageBreak/>
         <w:drawing>
           <wp:inline distT="0" distB="0" distL="0" distR="0" wp14:anchorId="1DED7202" wp14:editId="5AABCE3F">
@@ -6670,9 +6630,6 @@
     </w:p>
     <w:p>
       <w:r>
-        <w:rPr>
-          <w:noProof/>
-        </w:rPr>
         <w:drawing>
           <wp:inline distT="0" distB="0" distL="0" distR="0" wp14:anchorId="773B3096" wp14:editId="2DA16E64">
             <wp:extent cx="5943600" cy="4046855"/>
@@ -6712,9 +6669,6 @@
     </w:p>
     <w:p>
       <w:r>
-        <w:rPr>
-          <w:noProof/>
-        </w:rPr>
         <w:lastRenderedPageBreak/>
         <w:drawing>
           <wp:inline distT="0" distB="0" distL="0" distR="0" wp14:anchorId="08360368" wp14:editId="3A517C4D">
@@ -7446,7 +7400,6 @@
       <w:r>
         <w:rPr>
           <w:rFonts w:ascii="Courier New" w:eastAsia="Times New Roman" w:hAnsi="Courier New" w:cs="Courier New"/>
-          <w:noProof/>
           <w:sz w:val="20"/>
           <w:szCs w:val="20"/>
         </w:rPr>
@@ -7630,7 +7583,6 @@
       <w:r>
         <w:rPr>
           <w:rFonts w:ascii="Courier New" w:eastAsia="Times New Roman" w:hAnsi="Courier New" w:cs="Courier New"/>
-          <w:noProof/>
           <w:sz w:val="20"/>
           <w:szCs w:val="20"/>
         </w:rPr>
@@ -8130,7 +8082,6 @@
       <w:r>
         <w:rPr>
           <w:b/>
-          <w:noProof/>
         </w:rPr>
         <w:drawing>
           <wp:inline distT="0" distB="0" distL="0" distR="0" wp14:anchorId="116F23C2" wp14:editId="76476D49">
@@ -8178,7 +8129,6 @@
       <w:r>
         <w:rPr>
           <w:b/>
-          <w:noProof/>
         </w:rPr>
         <w:drawing>
           <wp:inline distT="0" distB="0" distL="0" distR="0" wp14:anchorId="1F409861" wp14:editId="2C5BA147">
@@ -8226,7 +8176,6 @@
       <w:r>
         <w:rPr>
           <w:b/>
-          <w:noProof/>
         </w:rPr>
         <w:lastRenderedPageBreak/>
         <w:drawing>
@@ -12496,7 +12445,6 @@
       <w:r>
         <w:rPr>
           <w:b/>
-          <w:noProof/>
         </w:rPr>
         <w:drawing>
           <wp:inline distT="0" distB="0" distL="0" distR="0" wp14:anchorId="408FEE05" wp14:editId="5AD021F4">
@@ -12544,7 +12492,6 @@
       <w:r>
         <w:rPr>
           <w:b/>
-          <w:noProof/>
         </w:rPr>
         <w:lastRenderedPageBreak/>
         <w:drawing>
@@ -12600,7 +12547,6 @@
       <w:r>
         <w:rPr>
           <w:b/>
-          <w:noProof/>
         </w:rPr>
         <w:lastRenderedPageBreak/>
         <w:drawing>
@@ -13892,6 +13838,7 @@
         <w:rPr>
           <w:rFonts w:eastAsia="Times New Roman" w:cs="Times New Roman"/>
         </w:rPr>
+        <w:lastRenderedPageBreak/>
         <w:t>You trained it on all data (</w:t>
       </w:r>
       <w:r>
@@ -13924,7 +13871,6 @@
         <w:rPr>
           <w:rFonts w:eastAsia="Times New Roman" w:cs="Times New Roman"/>
         </w:rPr>
-        <w:lastRenderedPageBreak/>
         <w:t xml:space="preserve">Once correct → it marks the exercise as </w:t>
       </w:r>
       <w:r>
@@ -14001,17 +13947,9 @@
       <w:r>
         <w:rPr>
           <w:rFonts w:cs="Times New Roman"/>
-          <w:b/>
           <w:szCs w:val="24"/>
         </w:rPr>
-        <w:t>Model definition</w:t>
-      </w:r>
-      <w:r>
-        <w:rPr>
-          <w:rFonts w:cs="Times New Roman"/>
-          <w:szCs w:val="24"/>
-        </w:rPr>
-        <w:t xml:space="preserve">: </w:t>
+        <w:t xml:space="preserve">Model definition: </w:t>
       </w:r>
       <w:r>
         <w:t>DecisionTreeRegressor(max_leaf_nodes=best_tree_size, random_state=1)</w:t>
@@ -14195,6 +14133,7 @@
           <w:b/>
           <w:bCs/>
         </w:rPr>
+        <w:lastRenderedPageBreak/>
         <w:t>Introduction to Random Forest</w:t>
       </w:r>
     </w:p>
@@ -14236,7 +14175,6 @@
         <w:rPr>
           <w:bCs/>
         </w:rPr>
-        <w:lastRenderedPageBreak/>
         <w:t xml:space="preserve">A </w:t>
       </w:r>
       <w:r>
@@ -14501,6 +14439,7 @@
           <w:b/>
           <w:bCs/>
         </w:rPr>
+        <w:lastRenderedPageBreak/>
         <w:t>Feature Selection</w:t>
       </w:r>
       <w:r>
@@ -14523,7 +14462,6 @@
         <w:pStyle w:val="Code"/>
       </w:pPr>
       <w:r>
-        <w:lastRenderedPageBreak/>
         <w:t>Features: melbourne_features = ['Rooms', 'Bathroom', 'Landsize', 'BuildingArea', 'YearBuilt', 'Lattitude', 'Longtitude']</w:t>
       </w:r>
     </w:p>
@@ -14736,6 +14674,7 @@
           <w:b/>
           <w:bCs/>
         </w:rPr>
+        <w:lastRenderedPageBreak/>
         <w:t>Random Forest’s Strength</w:t>
       </w:r>
       <w:r>
@@ -14760,7 +14699,6 @@
           <w:b/>
           <w:bCs/>
         </w:rPr>
-        <w:lastRenderedPageBreak/>
         <w:t>Room for Improvement</w:t>
       </w:r>
       <w:r>
@@ -14816,7 +14754,6 @@
       <w:r>
         <w:rPr>
           <w:b/>
-          <w:noProof/>
         </w:rPr>
         <w:drawing>
           <wp:inline distT="0" distB="0" distL="0" distR="0" wp14:anchorId="6A337799" wp14:editId="6883582F">
@@ -14875,6 +14812,1287 @@
           <w:b/>
         </w:rPr>
       </w:pPr>
+      <w:r>
+        <w:rPr>
+          <w:b/>
+        </w:rPr>
+        <w:lastRenderedPageBreak/>
+        <w:drawing>
+          <wp:inline distT="0" distB="0" distL="0" distR="0" wp14:anchorId="6EEE5A30" wp14:editId="200BAFE7">
+            <wp:extent cx="5943600" cy="2682875"/>
+            <wp:effectExtent l="0" t="0" r="0" b="3175"/>
+            <wp:docPr id="818141465" name="Picture 1" descr="A screenshot of a computer code&#10;&#10;AI-generated content may be incorrect."/>
+            <wp:cNvGraphicFramePr>
+              <a:graphicFrameLocks xmlns:a="http://schemas.openxmlformats.org/drawingml/2006/main" noChangeAspect="1"/>
+            </wp:cNvGraphicFramePr>
+            <a:graphic xmlns:a="http://schemas.openxmlformats.org/drawingml/2006/main">
+              <a:graphicData uri="http://schemas.openxmlformats.org/drawingml/2006/picture">
+                <pic:pic xmlns:pic="http://schemas.openxmlformats.org/drawingml/2006/picture">
+                  <pic:nvPicPr>
+                    <pic:cNvPr id="818141465" name="Picture 1" descr="A screenshot of a computer code&#10;&#10;AI-generated content may be incorrect."/>
+                    <pic:cNvPicPr/>
+                  </pic:nvPicPr>
+                  <pic:blipFill>
+                    <a:blip r:embed="rId32"/>
+                    <a:stretch>
+                      <a:fillRect/>
+                    </a:stretch>
+                  </pic:blipFill>
+                  <pic:spPr>
+                    <a:xfrm>
+                      <a:off x="0" y="0"/>
+                      <a:ext cx="5943600" cy="2682875"/>
+                    </a:xfrm>
+                    <a:prstGeom prst="rect">
+                      <a:avLst/>
+                    </a:prstGeom>
+                  </pic:spPr>
+                </pic:pic>
+              </a:graphicData>
+            </a:graphic>
+          </wp:inline>
+        </w:drawing>
+      </w:r>
+    </w:p>
+    <w:p>
+      <w:pPr>
+        <w:rPr>
+          <w:b/>
+          <w:bCs/>
+        </w:rPr>
+      </w:pPr>
+      <w:r>
+        <w:rPr>
+          <w:b/>
+          <w:bCs/>
+        </w:rPr>
+        <w:t>Step-by-Step Explanation:</w:t>
+      </w:r>
+    </w:p>
+    <w:p>
+      <w:pPr>
+        <w:rPr>
+          <w:bCs/>
+        </w:rPr>
+      </w:pPr>
+      <w:r>
+        <w:rPr>
+          <w:bCs/>
+        </w:rPr>
+        <w:pict w14:anchorId="262F7E50">
+          <v:rect id="_x0000_i1104" style="width:0;height:1.5pt" o:hralign="center" o:hrstd="t" o:hr="t" fillcolor="#a0a0a0" stroked="f"/>
+        </w:pict>
+      </w:r>
+    </w:p>
+    <w:p>
+      <w:pPr>
+        <w:rPr>
+          <w:b/>
+          <w:bCs/>
+        </w:rPr>
+      </w:pPr>
+      <w:r>
+        <w:rPr>
+          <w:b/>
+          <w:bCs/>
+        </w:rPr>
+        <w:t>1. Identify Columns with Missing Values</w:t>
+      </w:r>
+    </w:p>
+    <w:p>
+      <w:pPr>
+        <w:pStyle w:val="Code"/>
+      </w:pPr>
+      <w:r>
+        <w:t>cols_with_missing = [col for col in X_train.columns if X_train[col].isnull().any()]</w:t>
+      </w:r>
+    </w:p>
+    <w:p>
+      <w:pPr>
+        <w:numPr>
+          <w:ilvl w:val="0"/>
+          <w:numId w:val="42"/>
+        </w:numPr>
+        <w:rPr>
+          <w:bCs/>
+        </w:rPr>
+      </w:pPr>
+      <w:r>
+        <w:rPr>
+          <w:b/>
+          <w:bCs/>
+        </w:rPr>
+        <w:t>X_train.columns</w:t>
+      </w:r>
+      <w:r>
+        <w:rPr>
+          <w:bCs/>
+        </w:rPr>
+        <w:t>: This gives us all the column names (features) in the X_train DataFrame, which contains the training dataset without the target variable (y).</w:t>
+      </w:r>
+    </w:p>
+    <w:p>
+      <w:pPr>
+        <w:numPr>
+          <w:ilvl w:val="0"/>
+          <w:numId w:val="42"/>
+        </w:numPr>
+        <w:rPr>
+          <w:bCs/>
+        </w:rPr>
+      </w:pPr>
+      <w:r>
+        <w:rPr>
+          <w:b/>
+          <w:bCs/>
+        </w:rPr>
+        <w:t>X_train[col].isnull()</w:t>
+      </w:r>
+      <w:r>
+        <w:rPr>
+          <w:bCs/>
+        </w:rPr>
+        <w:t>: For each column (col), this checks for missing values (NaN). The isnull() function returns a boolean series (True if the value is missing, False otherwise).</w:t>
+      </w:r>
+    </w:p>
+    <w:p>
+      <w:pPr>
+        <w:numPr>
+          <w:ilvl w:val="0"/>
+          <w:numId w:val="42"/>
+        </w:numPr>
+        <w:rPr>
+          <w:bCs/>
+        </w:rPr>
+      </w:pPr>
+      <w:r>
+        <w:rPr>
+          <w:b/>
+          <w:bCs/>
+        </w:rPr>
+        <w:t>.any()</w:t>
+      </w:r>
+      <w:r>
+        <w:rPr>
+          <w:bCs/>
+        </w:rPr>
+        <w:t xml:space="preserve">: The any() function checks whether </w:t>
+      </w:r>
+      <w:r>
+        <w:rPr>
+          <w:b/>
+          <w:bCs/>
+        </w:rPr>
+        <w:t>any</w:t>
+      </w:r>
+      <w:r>
+        <w:rPr>
+          <w:bCs/>
+        </w:rPr>
+        <w:t xml:space="preserve"> value in the column is True (i.e., missing). This ensures that we only keep columns where </w:t>
+      </w:r>
+      <w:r>
+        <w:rPr>
+          <w:b/>
+          <w:bCs/>
+        </w:rPr>
+        <w:t>at least one</w:t>
+      </w:r>
+      <w:r>
+        <w:rPr>
+          <w:bCs/>
+        </w:rPr>
+        <w:t xml:space="preserve"> value is missing.</w:t>
+      </w:r>
+    </w:p>
+    <w:p>
+      <w:pPr>
+        <w:numPr>
+          <w:ilvl w:val="0"/>
+          <w:numId w:val="42"/>
+        </w:numPr>
+        <w:rPr>
+          <w:bCs/>
+        </w:rPr>
+      </w:pPr>
+      <w:r>
+        <w:rPr>
+          <w:b/>
+          <w:bCs/>
+        </w:rPr>
+        <w:t>cols_with_missing</w:t>
+      </w:r>
+      <w:r>
+        <w:rPr>
+          <w:bCs/>
+        </w:rPr>
+        <w:t xml:space="preserve">: This list comprehension creates a list of column names that contain </w:t>
+      </w:r>
+      <w:r>
+        <w:rPr>
+          <w:b/>
+          <w:bCs/>
+        </w:rPr>
+        <w:t>at least one missing value</w:t>
+      </w:r>
+      <w:r>
+        <w:rPr>
+          <w:bCs/>
+        </w:rPr>
+        <w:t>. It iterates over all columns in X_train, checks for missing values, and collects the names of those columns.</w:t>
+      </w:r>
+    </w:p>
+    <w:p>
+      <w:pPr>
+        <w:rPr>
+          <w:bCs/>
+        </w:rPr>
+      </w:pPr>
+      <w:r>
+        <w:rPr>
+          <w:bCs/>
+        </w:rPr>
+        <w:lastRenderedPageBreak/>
+        <w:drawing>
+          <wp:inline distT="0" distB="0" distL="0" distR="0" wp14:anchorId="5876B10E" wp14:editId="394F96EA">
+            <wp:extent cx="5943600" cy="3235325"/>
+            <wp:effectExtent l="0" t="0" r="0" b="3175"/>
+            <wp:docPr id="985837162" name="Picture 1" descr="A screenshot of a computer&#10;&#10;AI-generated content may be incorrect."/>
+            <wp:cNvGraphicFramePr>
+              <a:graphicFrameLocks xmlns:a="http://schemas.openxmlformats.org/drawingml/2006/main" noChangeAspect="1"/>
+            </wp:cNvGraphicFramePr>
+            <a:graphic xmlns:a="http://schemas.openxmlformats.org/drawingml/2006/main">
+              <a:graphicData uri="http://schemas.openxmlformats.org/drawingml/2006/picture">
+                <pic:pic xmlns:pic="http://schemas.openxmlformats.org/drawingml/2006/picture">
+                  <pic:nvPicPr>
+                    <pic:cNvPr id="985837162" name="Picture 1" descr="A screenshot of a computer&#10;&#10;AI-generated content may be incorrect."/>
+                    <pic:cNvPicPr/>
+                  </pic:nvPicPr>
+                  <pic:blipFill>
+                    <a:blip r:embed="rId33"/>
+                    <a:stretch>
+                      <a:fillRect/>
+                    </a:stretch>
+                  </pic:blipFill>
+                  <pic:spPr>
+                    <a:xfrm>
+                      <a:off x="0" y="0"/>
+                      <a:ext cx="5943600" cy="3235325"/>
+                    </a:xfrm>
+                    <a:prstGeom prst="rect">
+                      <a:avLst/>
+                    </a:prstGeom>
+                  </pic:spPr>
+                </pic:pic>
+              </a:graphicData>
+            </a:graphic>
+          </wp:inline>
+        </w:drawing>
+      </w:r>
+    </w:p>
+    <w:p>
+      <w:pPr>
+        <w:rPr>
+          <w:bCs/>
+        </w:rPr>
+      </w:pPr>
+      <w:r>
+        <w:rPr>
+          <w:bCs/>
+        </w:rPr>
+        <w:drawing>
+          <wp:inline distT="0" distB="0" distL="0" distR="0" wp14:anchorId="04A73BC8" wp14:editId="72AE2CFA">
+            <wp:extent cx="5943600" cy="3324860"/>
+            <wp:effectExtent l="0" t="0" r="0" b="8890"/>
+            <wp:docPr id="178307167" name="Picture 1" descr="A screenshot of a computer error&#10;&#10;AI-generated content may be incorrect."/>
+            <wp:cNvGraphicFramePr>
+              <a:graphicFrameLocks xmlns:a="http://schemas.openxmlformats.org/drawingml/2006/main" noChangeAspect="1"/>
+            </wp:cNvGraphicFramePr>
+            <a:graphic xmlns:a="http://schemas.openxmlformats.org/drawingml/2006/main">
+              <a:graphicData uri="http://schemas.openxmlformats.org/drawingml/2006/picture">
+                <pic:pic xmlns:pic="http://schemas.openxmlformats.org/drawingml/2006/picture">
+                  <pic:nvPicPr>
+                    <pic:cNvPr id="178307167" name="Picture 1" descr="A screenshot of a computer error&#10;&#10;AI-generated content may be incorrect."/>
+                    <pic:cNvPicPr/>
+                  </pic:nvPicPr>
+                  <pic:blipFill>
+                    <a:blip r:embed="rId34"/>
+                    <a:stretch>
+                      <a:fillRect/>
+                    </a:stretch>
+                  </pic:blipFill>
+                  <pic:spPr>
+                    <a:xfrm>
+                      <a:off x="0" y="0"/>
+                      <a:ext cx="5943600" cy="3324860"/>
+                    </a:xfrm>
+                    <a:prstGeom prst="rect">
+                      <a:avLst/>
+                    </a:prstGeom>
+                  </pic:spPr>
+                </pic:pic>
+              </a:graphicData>
+            </a:graphic>
+          </wp:inline>
+        </w:drawing>
+      </w:r>
+    </w:p>
+    <w:p>
+      <w:pPr>
+        <w:rPr>
+          <w:bCs/>
+        </w:rPr>
+      </w:pPr>
+    </w:p>
+    <w:p>
+      <w:pPr>
+        <w:rPr>
+          <w:bCs/>
+        </w:rPr>
+      </w:pPr>
+    </w:p>
+    <w:p>
+      <w:pPr>
+        <w:rPr>
+          <w:bCs/>
+        </w:rPr>
+      </w:pPr>
+      <w:r>
+        <w:rPr>
+          <w:bCs/>
+        </w:rPr>
+        <w:lastRenderedPageBreak/>
+        <w:drawing>
+          <wp:inline distT="0" distB="0" distL="0" distR="0" wp14:anchorId="039272EF" wp14:editId="08E0BE35">
+            <wp:extent cx="5943600" cy="3340100"/>
+            <wp:effectExtent l="0" t="0" r="0" b="0"/>
+            <wp:docPr id="1045391196" name="Picture 1" descr="A screenshot of a computer code&#10;&#10;AI-generated content may be incorrect."/>
+            <wp:cNvGraphicFramePr>
+              <a:graphicFrameLocks xmlns:a="http://schemas.openxmlformats.org/drawingml/2006/main" noChangeAspect="1"/>
+            </wp:cNvGraphicFramePr>
+            <a:graphic xmlns:a="http://schemas.openxmlformats.org/drawingml/2006/main">
+              <a:graphicData uri="http://schemas.openxmlformats.org/drawingml/2006/picture">
+                <pic:pic xmlns:pic="http://schemas.openxmlformats.org/drawingml/2006/picture">
+                  <pic:nvPicPr>
+                    <pic:cNvPr id="1045391196" name="Picture 1" descr="A screenshot of a computer code&#10;&#10;AI-generated content may be incorrect."/>
+                    <pic:cNvPicPr/>
+                  </pic:nvPicPr>
+                  <pic:blipFill>
+                    <a:blip r:embed="rId35"/>
+                    <a:stretch>
+                      <a:fillRect/>
+                    </a:stretch>
+                  </pic:blipFill>
+                  <pic:spPr>
+                    <a:xfrm>
+                      <a:off x="0" y="0"/>
+                      <a:ext cx="5943600" cy="3340100"/>
+                    </a:xfrm>
+                    <a:prstGeom prst="rect">
+                      <a:avLst/>
+                    </a:prstGeom>
+                  </pic:spPr>
+                </pic:pic>
+              </a:graphicData>
+            </a:graphic>
+          </wp:inline>
+        </w:drawing>
+      </w:r>
+    </w:p>
+    <w:p>
+      <w:pPr>
+        <w:rPr>
+          <w:b/>
+          <w:bCs/>
+        </w:rPr>
+      </w:pPr>
+      <w:r>
+        <w:rPr>
+          <w:b/>
+          <w:bCs/>
+        </w:rPr>
+        <w:t>Step-by-Step Explanation of Code:</w:t>
+      </w:r>
+    </w:p>
+    <w:p>
+      <w:pPr>
+        <w:rPr>
+          <w:bCs/>
+        </w:rPr>
+      </w:pPr>
+      <w:r>
+        <w:rPr>
+          <w:bCs/>
+        </w:rPr>
+        <w:pict w14:anchorId="7BE947AA">
+          <v:rect id="_x0000_i1154" style="width:0;height:1.5pt" o:hralign="center" o:hrstd="t" o:hr="t" fillcolor="#a0a0a0" stroked="f"/>
+        </w:pict>
+      </w:r>
+    </w:p>
+    <w:p>
+      <w:pPr>
+        <w:rPr>
+          <w:b/>
+          <w:bCs/>
+        </w:rPr>
+      </w:pPr>
+      <w:r>
+        <w:rPr>
+          <w:b/>
+          <w:bCs/>
+        </w:rPr>
+        <w:t>1. Importing the SimpleImputer Class</w:t>
+      </w:r>
+    </w:p>
+    <w:p>
+      <w:pPr>
+        <w:pStyle w:val="Code"/>
+      </w:pPr>
+      <w:r>
+        <w:t>from sklearn.impute import SimpleImputer</w:t>
+      </w:r>
+    </w:p>
+    <w:p>
+      <w:pPr>
+        <w:numPr>
+          <w:ilvl w:val="0"/>
+          <w:numId w:val="43"/>
+        </w:numPr>
+        <w:rPr>
+          <w:bCs/>
+        </w:rPr>
+      </w:pPr>
+      <w:r>
+        <w:rPr>
+          <w:b/>
+          <w:bCs/>
+        </w:rPr>
+        <w:t>SimpleImputer</w:t>
+      </w:r>
+      <w:r>
+        <w:rPr>
+          <w:bCs/>
+        </w:rPr>
+        <w:t>: This is a class from the sklearn.impute module. It's used to handle missing values by replacing them with a specific value or strategy (e.g., mean, median, most frequent value).</w:t>
+      </w:r>
+    </w:p>
+    <w:p>
+      <w:pPr>
+        <w:numPr>
+          <w:ilvl w:val="0"/>
+          <w:numId w:val="43"/>
+        </w:numPr>
+        <w:rPr>
+          <w:bCs/>
+        </w:rPr>
+      </w:pPr>
+      <w:r>
+        <w:rPr>
+          <w:b/>
+          <w:bCs/>
+        </w:rPr>
+        <w:t>Purpose</w:t>
+      </w:r>
+      <w:r>
+        <w:rPr>
+          <w:bCs/>
+        </w:rPr>
+        <w:t>: The SimpleImputer will help fill in (impute) missing data in the dataset.</w:t>
+      </w:r>
+    </w:p>
+    <w:p>
+      <w:pPr>
+        <w:rPr>
+          <w:bCs/>
+        </w:rPr>
+      </w:pPr>
+      <w:r>
+        <w:rPr>
+          <w:bCs/>
+        </w:rPr>
+        <w:pict w14:anchorId="3F6F34A0">
+          <v:rect id="_x0000_i1155" style="width:0;height:1.5pt" o:hralign="center" o:hrstd="t" o:hr="t" fillcolor="#a0a0a0" stroked="f"/>
+        </w:pict>
+      </w:r>
+    </w:p>
+    <w:p>
+      <w:pPr>
+        <w:rPr>
+          <w:b/>
+          <w:bCs/>
+        </w:rPr>
+      </w:pPr>
+      <w:r>
+        <w:rPr>
+          <w:b/>
+          <w:bCs/>
+        </w:rPr>
+        <w:t>2. Creating the Imputer Object</w:t>
+      </w:r>
+    </w:p>
+    <w:p>
+      <w:pPr>
+        <w:pStyle w:val="Code"/>
+      </w:pPr>
+      <w:r>
+        <w:t>my_imputer = SimpleImputer()</w:t>
+      </w:r>
+    </w:p>
+    <w:p>
+      <w:pPr>
+        <w:numPr>
+          <w:ilvl w:val="0"/>
+          <w:numId w:val="44"/>
+        </w:numPr>
+        <w:rPr>
+          <w:bCs/>
+        </w:rPr>
+      </w:pPr>
+      <w:r>
+        <w:rPr>
+          <w:b/>
+          <w:bCs/>
+        </w:rPr>
+        <w:t>SimpleImputer()</w:t>
+      </w:r>
+      <w:r>
+        <w:rPr>
+          <w:bCs/>
+        </w:rPr>
+        <w:t>: This creates an instance of the SimpleImputer class.</w:t>
+      </w:r>
+    </w:p>
+    <w:p>
+      <w:pPr>
+        <w:numPr>
+          <w:ilvl w:val="1"/>
+          <w:numId w:val="44"/>
+        </w:numPr>
+        <w:rPr>
+          <w:bCs/>
+        </w:rPr>
+      </w:pPr>
+      <w:r>
+        <w:rPr>
+          <w:bCs/>
+        </w:rPr>
+        <w:t xml:space="preserve">By default, it replaces missing values with the </w:t>
+      </w:r>
+      <w:r>
+        <w:rPr>
+          <w:b/>
+          <w:bCs/>
+        </w:rPr>
+        <w:t>mean</w:t>
+      </w:r>
+      <w:r>
+        <w:rPr>
+          <w:bCs/>
+        </w:rPr>
+        <w:t xml:space="preserve"> value of the respective columns.</w:t>
+      </w:r>
+    </w:p>
+    <w:p>
+      <w:pPr>
+        <w:rPr>
+          <w:bCs/>
+        </w:rPr>
+      </w:pPr>
+      <w:r>
+        <w:rPr>
+          <w:bCs/>
+        </w:rPr>
+        <w:lastRenderedPageBreak/>
+        <w:pict w14:anchorId="2842BF4F">
+          <v:rect id="_x0000_i1156" style="width:0;height:1.5pt" o:hralign="center" o:hrstd="t" o:hr="t" fillcolor="#a0a0a0" stroked="f"/>
+        </w:pict>
+      </w:r>
+    </w:p>
+    <w:p>
+      <w:pPr>
+        <w:rPr>
+          <w:b/>
+          <w:bCs/>
+        </w:rPr>
+      </w:pPr>
+      <w:r>
+        <w:rPr>
+          <w:b/>
+          <w:bCs/>
+        </w:rPr>
+        <w:t>3. Fitting and Transforming the Training Data</w:t>
+      </w:r>
+    </w:p>
+    <w:p>
+      <w:pPr>
+        <w:pStyle w:val="Code"/>
+      </w:pPr>
+      <w:r>
+        <w:t>imputed_X_train = pd.DataFrame(my_imputer.fit_transform(X_train))</w:t>
+      </w:r>
+    </w:p>
+    <w:p>
+      <w:pPr>
+        <w:numPr>
+          <w:ilvl w:val="0"/>
+          <w:numId w:val="45"/>
+        </w:numPr>
+        <w:rPr>
+          <w:bCs/>
+        </w:rPr>
+      </w:pPr>
+      <w:r>
+        <w:rPr>
+          <w:b/>
+          <w:bCs/>
+        </w:rPr>
+        <w:t>my_imputer.fit_transform(X_train)</w:t>
+      </w:r>
+      <w:r>
+        <w:rPr>
+          <w:bCs/>
+        </w:rPr>
+        <w:t>:</w:t>
+      </w:r>
+    </w:p>
+    <w:p>
+      <w:pPr>
+        <w:numPr>
+          <w:ilvl w:val="1"/>
+          <w:numId w:val="45"/>
+        </w:numPr>
+        <w:rPr>
+          <w:bCs/>
+        </w:rPr>
+      </w:pPr>
+      <w:r>
+        <w:rPr>
+          <w:b/>
+          <w:bCs/>
+        </w:rPr>
+        <w:t>fit()</w:t>
+      </w:r>
+      <w:r>
+        <w:rPr>
+          <w:bCs/>
+        </w:rPr>
+        <w:t>: Computes the imputation statistics (e.g., mean) for each column in the training data (X_train).</w:t>
+      </w:r>
+    </w:p>
+    <w:p>
+      <w:pPr>
+        <w:numPr>
+          <w:ilvl w:val="1"/>
+          <w:numId w:val="45"/>
+        </w:numPr>
+        <w:rPr>
+          <w:bCs/>
+        </w:rPr>
+      </w:pPr>
+      <w:r>
+        <w:rPr>
+          <w:b/>
+          <w:bCs/>
+        </w:rPr>
+        <w:t>transform()</w:t>
+      </w:r>
+      <w:r>
+        <w:rPr>
+          <w:bCs/>
+        </w:rPr>
+        <w:t>: Uses those statistics to fill in the missing values in X_train.</w:t>
+      </w:r>
+    </w:p>
+    <w:p>
+      <w:pPr>
+        <w:numPr>
+          <w:ilvl w:val="0"/>
+          <w:numId w:val="45"/>
+        </w:numPr>
+        <w:rPr>
+          <w:bCs/>
+        </w:rPr>
+      </w:pPr>
+      <w:r>
+        <w:rPr>
+          <w:bCs/>
+        </w:rPr>
+        <w:t xml:space="preserve">The imputed data is returned as a numpy array, which is then converted back to a pandas DataFrame using </w:t>
+      </w:r>
+      <w:r>
+        <w:rPr>
+          <w:b/>
+          <w:bCs/>
+        </w:rPr>
+        <w:t>pd.DataFrame()</w:t>
+      </w:r>
+      <w:r>
+        <w:rPr>
+          <w:bCs/>
+        </w:rPr>
+        <w:t>.</w:t>
+      </w:r>
+    </w:p>
+    <w:p>
+      <w:pPr>
+        <w:numPr>
+          <w:ilvl w:val="0"/>
+          <w:numId w:val="45"/>
+        </w:numPr>
+        <w:rPr>
+          <w:bCs/>
+        </w:rPr>
+      </w:pPr>
+      <w:r>
+        <w:rPr>
+          <w:b/>
+          <w:bCs/>
+        </w:rPr>
+        <w:t>imputed_X_train</w:t>
+      </w:r>
+      <w:r>
+        <w:rPr>
+          <w:bCs/>
+        </w:rPr>
+        <w:t>: This contains the imputed version of the training data, where missing values have been replaced by the column mean.</w:t>
+      </w:r>
+    </w:p>
+    <w:p>
+      <w:pPr>
+        <w:rPr>
+          <w:bCs/>
+        </w:rPr>
+      </w:pPr>
+      <w:r>
+        <w:rPr>
+          <w:bCs/>
+        </w:rPr>
+        <w:pict w14:anchorId="23B203BB">
+          <v:rect id="_x0000_i1157" style="width:0;height:1.5pt" o:hralign="center" o:hrstd="t" o:hr="t" fillcolor="#a0a0a0" stroked="f"/>
+        </w:pict>
+      </w:r>
+    </w:p>
+    <w:p>
+      <w:pPr>
+        <w:rPr>
+          <w:b/>
+          <w:bCs/>
+        </w:rPr>
+      </w:pPr>
+      <w:r>
+        <w:rPr>
+          <w:b/>
+          <w:bCs/>
+        </w:rPr>
+        <w:t>4. Transforming the Validation Data</w:t>
+      </w:r>
+    </w:p>
+    <w:p>
+      <w:pPr>
+        <w:pStyle w:val="Code"/>
+      </w:pPr>
+      <w:r>
+        <w:t>imputed_X_valid = pd.DataFrame(my_imputer.transform(X_valid))</w:t>
+      </w:r>
+    </w:p>
+    <w:p>
+      <w:pPr>
+        <w:numPr>
+          <w:ilvl w:val="0"/>
+          <w:numId w:val="46"/>
+        </w:numPr>
+        <w:rPr>
+          <w:bCs/>
+        </w:rPr>
+      </w:pPr>
+      <w:r>
+        <w:rPr>
+          <w:b/>
+          <w:bCs/>
+        </w:rPr>
+        <w:t>transform(X_valid)</w:t>
+      </w:r>
+      <w:r>
+        <w:rPr>
+          <w:bCs/>
+        </w:rPr>
+        <w:t xml:space="preserve">: After fitting the SimpleImputer to X_train, the </w:t>
+      </w:r>
+      <w:r>
+        <w:rPr>
+          <w:b/>
+          <w:bCs/>
+        </w:rPr>
+        <w:t>transform()</w:t>
+      </w:r>
+      <w:r>
+        <w:rPr>
+          <w:bCs/>
+        </w:rPr>
+        <w:t xml:space="preserve"> function is applied to the validation set (X_valid) to replace missing values with the same statistics (i.e., the mean calculated from the training data).</w:t>
+      </w:r>
+    </w:p>
+    <w:p>
+      <w:pPr>
+        <w:numPr>
+          <w:ilvl w:val="0"/>
+          <w:numId w:val="46"/>
+        </w:numPr>
+        <w:rPr>
+          <w:bCs/>
+        </w:rPr>
+      </w:pPr>
+      <w:r>
+        <w:rPr>
+          <w:b/>
+          <w:bCs/>
+        </w:rPr>
+        <w:t>imputed_X_valid</w:t>
+      </w:r>
+      <w:r>
+        <w:rPr>
+          <w:bCs/>
+        </w:rPr>
+        <w:t>: This is the imputed version of the validation set, where missing values have been replaced by the column means from X_train.</w:t>
+      </w:r>
+    </w:p>
+    <w:p>
+      <w:pPr>
+        <w:rPr>
+          <w:bCs/>
+        </w:rPr>
+      </w:pPr>
+      <w:r>
+        <w:rPr>
+          <w:bCs/>
+        </w:rPr>
+        <w:pict w14:anchorId="7F45E217">
+          <v:rect id="_x0000_i1158" style="width:0;height:1.5pt" o:hralign="center" o:hrstd="t" o:hr="t" fillcolor="#a0a0a0" stroked="f"/>
+        </w:pict>
+      </w:r>
+    </w:p>
+    <w:p>
+      <w:pPr>
+        <w:rPr>
+          <w:b/>
+          <w:bCs/>
+        </w:rPr>
+      </w:pPr>
+      <w:r>
+        <w:rPr>
+          <w:b/>
+          <w:bCs/>
+        </w:rPr>
+        <w:t>5. Restoring Column Names to the Imputed Data</w:t>
+      </w:r>
+    </w:p>
+    <w:p>
+      <w:pPr>
+        <w:pStyle w:val="Code"/>
+      </w:pPr>
+      <w:r>
+        <w:t>imputed_X_train.columns = X_train.columns</w:t>
+      </w:r>
+    </w:p>
+    <w:p>
+      <w:pPr>
+        <w:pStyle w:val="Code"/>
+      </w:pPr>
+      <w:r>
+        <w:t>imputed_X_valid.columns = X_valid.columns</w:t>
+      </w:r>
+    </w:p>
+    <w:p>
+      <w:pPr>
+        <w:numPr>
+          <w:ilvl w:val="0"/>
+          <w:numId w:val="47"/>
+        </w:numPr>
+        <w:rPr>
+          <w:bCs/>
+        </w:rPr>
+      </w:pPr>
+      <w:r>
+        <w:rPr>
+          <w:b/>
+          <w:bCs/>
+        </w:rPr>
+        <w:lastRenderedPageBreak/>
+        <w:t>Column names</w:t>
+      </w:r>
+      <w:r>
+        <w:rPr>
+          <w:bCs/>
+        </w:rPr>
+        <w:t xml:space="preserve"> are </w:t>
+      </w:r>
+      <w:r>
+        <w:rPr>
+          <w:b/>
+          <w:bCs/>
+        </w:rPr>
+        <w:t>lost</w:t>
+      </w:r>
+      <w:r>
+        <w:rPr>
+          <w:bCs/>
+        </w:rPr>
+        <w:t xml:space="preserve"> during imputation because the data is transformed into a numpy array, which doesn't retain column names.</w:t>
+      </w:r>
+    </w:p>
+    <w:p>
+      <w:pPr>
+        <w:numPr>
+          <w:ilvl w:val="0"/>
+          <w:numId w:val="47"/>
+        </w:numPr>
+        <w:rPr>
+          <w:bCs/>
+        </w:rPr>
+      </w:pPr>
+      <w:r>
+        <w:rPr>
+          <w:bCs/>
+        </w:rPr>
+        <w:t>These lines ensure that the imputed DataFrames (imputed_X_train and imputed_X_valid) have the same column names as the original training (X_train) and validation (X_valid) datasets.</w:t>
+      </w:r>
+    </w:p>
+    <w:p>
+      <w:pPr>
+        <w:rPr>
+          <w:bCs/>
+        </w:rPr>
+      </w:pPr>
+      <w:r>
+        <w:rPr>
+          <w:bCs/>
+        </w:rPr>
+        <w:pict w14:anchorId="36FF7F4C">
+          <v:rect id="_x0000_i1159" style="width:0;height:1.5pt" o:hralign="center" o:hrstd="t" o:hr="t" fillcolor="#a0a0a0" stroked="f"/>
+        </w:pict>
+      </w:r>
+    </w:p>
+    <w:p>
+      <w:pPr>
+        <w:rPr>
+          <w:b/>
+          <w:bCs/>
+        </w:rPr>
+      </w:pPr>
+      <w:r>
+        <w:rPr>
+          <w:b/>
+          <w:bCs/>
+        </w:rPr>
+        <w:t>6. Evaluating the Model with Imputed Data</w:t>
+      </w:r>
+    </w:p>
+    <w:p>
+      <w:pPr>
+        <w:rPr>
+          <w:bCs/>
+        </w:rPr>
+      </w:pPr>
+      <w:r>
+        <w:rPr>
+          <w:bCs/>
+        </w:rPr>
+        <w:t>print("MAE from Approach 2 (Imputation):")</w:t>
+      </w:r>
+    </w:p>
+    <w:p>
+      <w:pPr>
+        <w:rPr>
+          <w:bCs/>
+        </w:rPr>
+      </w:pPr>
+      <w:r>
+        <w:rPr>
+          <w:bCs/>
+        </w:rPr>
+        <w:t>print(score_dataset(imputed_X_train, imputed_X_valid, y_train, y_valid))</w:t>
+      </w:r>
+    </w:p>
+    <w:p>
+      <w:pPr>
+        <w:numPr>
+          <w:ilvl w:val="0"/>
+          <w:numId w:val="48"/>
+        </w:numPr>
+        <w:rPr>
+          <w:bCs/>
+        </w:rPr>
+      </w:pPr>
+      <w:r>
+        <w:rPr>
+          <w:b/>
+          <w:bCs/>
+        </w:rPr>
+        <w:t>score_dataset()</w:t>
+      </w:r>
+      <w:r>
+        <w:rPr>
+          <w:bCs/>
+        </w:rPr>
+        <w:t>: This function (presumably defined earlier) evaluates the model using the imputed training and validation data.</w:t>
+      </w:r>
+    </w:p>
+    <w:p>
+      <w:pPr>
+        <w:numPr>
+          <w:ilvl w:val="1"/>
+          <w:numId w:val="48"/>
+        </w:numPr>
+        <w:rPr>
+          <w:bCs/>
+        </w:rPr>
+      </w:pPr>
+      <w:r>
+        <w:rPr>
+          <w:bCs/>
+        </w:rPr>
+        <w:t xml:space="preserve">It calculates the </w:t>
+      </w:r>
+      <w:r>
+        <w:rPr>
+          <w:b/>
+          <w:bCs/>
+        </w:rPr>
+        <w:t>Mean Absolute Error (MAE)</w:t>
+      </w:r>
+      <w:r>
+        <w:rPr>
+          <w:bCs/>
+        </w:rPr>
+        <w:t>, which measures how far off the predictions are from the actual values (i.e., it quantifies the error between predicted and actual home prices).</w:t>
+      </w:r>
+    </w:p>
+    <w:p>
+      <w:pPr>
+        <w:numPr>
+          <w:ilvl w:val="0"/>
+          <w:numId w:val="48"/>
+        </w:numPr>
+        <w:rPr>
+          <w:bCs/>
+        </w:rPr>
+      </w:pPr>
+      <w:r>
+        <w:rPr>
+          <w:b/>
+          <w:bCs/>
+        </w:rPr>
+        <w:t>MAE</w:t>
+      </w:r>
+      <w:r>
+        <w:rPr>
+          <w:bCs/>
+        </w:rPr>
+        <w:t>: The printed result, 178166.46269899711, is the performance of the model using imputed data, where missing values were filled with the mean of each column.</w:t>
+      </w:r>
+    </w:p>
+    <w:p>
+      <w:pPr>
+        <w:rPr>
+          <w:bCs/>
+        </w:rPr>
+      </w:pPr>
+      <w:r>
+        <w:rPr>
+          <w:bCs/>
+        </w:rPr>
+        <w:pict w14:anchorId="02C352AA">
+          <v:rect id="_x0000_i1160" style="width:0;height:1.5pt" o:hralign="center" o:hrstd="t" o:hr="t" fillcolor="#a0a0a0" stroked="f"/>
+        </w:pict>
+      </w:r>
+    </w:p>
+    <w:p>
+      <w:pPr>
+        <w:rPr>
+          <w:b/>
+          <w:bCs/>
+        </w:rPr>
+      </w:pPr>
+      <w:r>
+        <w:rPr>
+          <w:b/>
+          <w:bCs/>
+        </w:rPr>
+        <w:t>Explanation of Key Concepts:</w:t>
+      </w:r>
+    </w:p>
+    <w:p>
+      <w:pPr>
+        <w:numPr>
+          <w:ilvl w:val="0"/>
+          <w:numId w:val="49"/>
+        </w:numPr>
+        <w:rPr>
+          <w:bCs/>
+        </w:rPr>
+      </w:pPr>
+      <w:r>
+        <w:rPr>
+          <w:b/>
+          <w:bCs/>
+        </w:rPr>
+        <w:t>Imputation</w:t>
+      </w:r>
+      <w:r>
+        <w:rPr>
+          <w:bCs/>
+        </w:rPr>
+        <w:t xml:space="preserve">: Imputing missing values is a technique used to fill in missing data, and in this case, the imputer replaces missing values with the </w:t>
+      </w:r>
+      <w:r>
+        <w:rPr>
+          <w:b/>
+          <w:bCs/>
+        </w:rPr>
+        <w:t>mean</w:t>
+      </w:r>
+      <w:r>
+        <w:rPr>
+          <w:bCs/>
+        </w:rPr>
+        <w:t xml:space="preserve"> value of the respective column. This approach is particularly useful when the missing data is not random, and removing rows would lead to a significant loss of information.</w:t>
+      </w:r>
+    </w:p>
+    <w:p>
+      <w:pPr>
+        <w:numPr>
+          <w:ilvl w:val="0"/>
+          <w:numId w:val="49"/>
+        </w:numPr>
+        <w:rPr>
+          <w:bCs/>
+        </w:rPr>
+      </w:pPr>
+      <w:r>
+        <w:rPr>
+          <w:b/>
+          <w:bCs/>
+        </w:rPr>
+        <w:lastRenderedPageBreak/>
+        <w:t>MAE (Mean Absolute Error)</w:t>
+      </w:r>
+      <w:r>
+        <w:rPr>
+          <w:bCs/>
+        </w:rPr>
+        <w:t>: It is a metric used to measure the accuracy of the model. The lower the MAE, the better the model’s predictions.</w:t>
+      </w:r>
+    </w:p>
+    <w:p>
+      <w:pPr>
+        <w:rPr>
+          <w:bCs/>
+        </w:rPr>
+      </w:pPr>
+      <w:r>
+        <w:rPr>
+          <w:bCs/>
+        </w:rPr>
+        <w:pict w14:anchorId="1A47053F">
+          <v:rect id="_x0000_i1161" style="width:0;height:1.5pt" o:hralign="center" o:hrstd="t" o:hr="t" fillcolor="#a0a0a0" stroked="f"/>
+        </w:pict>
+      </w:r>
+    </w:p>
+    <w:p>
+      <w:pPr>
+        <w:rPr>
+          <w:b/>
+          <w:bCs/>
+        </w:rPr>
+      </w:pPr>
+      <w:r>
+        <w:rPr>
+          <w:b/>
+          <w:bCs/>
+        </w:rPr>
+        <w:t>Conclusion:</w:t>
+      </w:r>
+    </w:p>
+    <w:p>
+      <w:pPr>
+        <w:numPr>
+          <w:ilvl w:val="0"/>
+          <w:numId w:val="50"/>
+        </w:numPr>
+        <w:rPr>
+          <w:bCs/>
+        </w:rPr>
+      </w:pPr>
+      <w:r>
+        <w:rPr>
+          <w:b/>
+          <w:bCs/>
+        </w:rPr>
+        <w:t>Imputation</w:t>
+      </w:r>
+      <w:r>
+        <w:rPr>
+          <w:bCs/>
+        </w:rPr>
+        <w:t xml:space="preserve"> replaces missing data with the mean value of each column, allowing you to keep more data for model training compared to </w:t>
+      </w:r>
+      <w:r>
+        <w:rPr>
+          <w:b/>
+          <w:bCs/>
+        </w:rPr>
+        <w:t>dropping columns</w:t>
+      </w:r>
+      <w:r>
+        <w:rPr>
+          <w:bCs/>
+        </w:rPr>
+        <w:t>.</w:t>
+      </w:r>
+    </w:p>
+    <w:p>
+      <w:pPr>
+        <w:numPr>
+          <w:ilvl w:val="0"/>
+          <w:numId w:val="50"/>
+        </w:numPr>
+        <w:rPr>
+          <w:bCs/>
+        </w:rPr>
+      </w:pPr>
+      <w:r>
+        <w:rPr>
+          <w:b/>
+          <w:bCs/>
+        </w:rPr>
+        <w:t>Model Performance</w:t>
+      </w:r>
+      <w:r>
+        <w:rPr>
+          <w:bCs/>
+        </w:rPr>
+        <w:t xml:space="preserve">: After imputing the missing values, the model’s performance (as measured by </w:t>
+      </w:r>
+      <w:r>
+        <w:rPr>
+          <w:b/>
+          <w:bCs/>
+        </w:rPr>
+        <w:t>MAE</w:t>
+      </w:r>
+      <w:r>
+        <w:rPr>
+          <w:bCs/>
+        </w:rPr>
+        <w:t>) is reported, which helps to assess the effectiveness of imputation as a strategy for handling missing data.</w:t>
+      </w:r>
+    </w:p>
+    <w:p>
+      <w:pPr>
+        <w:rPr>
+          <w:bCs/>
+        </w:rPr>
+      </w:pPr>
     </w:p>
     <w:sectPr>
       <w:pgSz w:w="12240" w:h="15840"/>
@@ -15038,6 +16256,119 @@
     </w:lvl>
   </w:abstractNum>
   <w:abstractNum w:abstractNumId="1" w15:restartNumberingAfterBreak="0">
+    <w:nsid w:val="025F2A20"/>
+    <w:multiLevelType w:val="multilevel"/>
+    <w:tmpl w:val="8250D306"/>
+    <w:lvl w:ilvl="0">
+      <w:start w:val="1"/>
+      <w:numFmt w:val="decimal"/>
+      <w:lvlText w:val="%1."/>
+      <w:lvlJc w:val="left"/>
+      <w:pPr>
+        <w:tabs>
+          <w:tab w:val="num" w:pos="720"/>
+        </w:tabs>
+        <w:ind w:left="720" w:hanging="360"/>
+      </w:pPr>
+    </w:lvl>
+    <w:lvl w:ilvl="1" w:tentative="1">
+      <w:start w:val="1"/>
+      <w:numFmt w:val="decimal"/>
+      <w:lvlText w:val="%2."/>
+      <w:lvlJc w:val="left"/>
+      <w:pPr>
+        <w:tabs>
+          <w:tab w:val="num" w:pos="1440"/>
+        </w:tabs>
+        <w:ind w:left="1440" w:hanging="360"/>
+      </w:pPr>
+    </w:lvl>
+    <w:lvl w:ilvl="2" w:tentative="1">
+      <w:start w:val="1"/>
+      <w:numFmt w:val="decimal"/>
+      <w:lvlText w:val="%3."/>
+      <w:lvlJc w:val="left"/>
+      <w:pPr>
+        <w:tabs>
+          <w:tab w:val="num" w:pos="2160"/>
+        </w:tabs>
+        <w:ind w:left="2160" w:hanging="360"/>
+      </w:pPr>
+    </w:lvl>
+    <w:lvl w:ilvl="3" w:tentative="1">
+      <w:start w:val="1"/>
+      <w:numFmt w:val="decimal"/>
+      <w:lvlText w:val="%4."/>
+      <w:lvlJc w:val="left"/>
+      <w:pPr>
+        <w:tabs>
+          <w:tab w:val="num" w:pos="2880"/>
+        </w:tabs>
+        <w:ind w:left="2880" w:hanging="360"/>
+      </w:pPr>
+    </w:lvl>
+    <w:lvl w:ilvl="4" w:tentative="1">
+      <w:start w:val="1"/>
+      <w:numFmt w:val="decimal"/>
+      <w:lvlText w:val="%5."/>
+      <w:lvlJc w:val="left"/>
+      <w:pPr>
+        <w:tabs>
+          <w:tab w:val="num" w:pos="3600"/>
+        </w:tabs>
+        <w:ind w:left="3600" w:hanging="360"/>
+      </w:pPr>
+    </w:lvl>
+    <w:lvl w:ilvl="5" w:tentative="1">
+      <w:start w:val="1"/>
+      <w:numFmt w:val="decimal"/>
+      <w:lvlText w:val="%6."/>
+      <w:lvlJc w:val="left"/>
+      <w:pPr>
+        <w:tabs>
+          <w:tab w:val="num" w:pos="4320"/>
+        </w:tabs>
+        <w:ind w:left="4320" w:hanging="360"/>
+      </w:pPr>
+    </w:lvl>
+    <w:lvl w:ilvl="6" w:tentative="1">
+      <w:start w:val="1"/>
+      <w:numFmt w:val="decimal"/>
+      <w:lvlText w:val="%7."/>
+      <w:lvlJc w:val="left"/>
+      <w:pPr>
+        <w:tabs>
+          <w:tab w:val="num" w:pos="5040"/>
+        </w:tabs>
+        <w:ind w:left="5040" w:hanging="360"/>
+      </w:pPr>
+    </w:lvl>
+    <w:lvl w:ilvl="7" w:tentative="1">
+      <w:start w:val="1"/>
+      <w:numFmt w:val="decimal"/>
+      <w:lvlText w:val="%8."/>
+      <w:lvlJc w:val="left"/>
+      <w:pPr>
+        <w:tabs>
+          <w:tab w:val="num" w:pos="5760"/>
+        </w:tabs>
+        <w:ind w:left="5760" w:hanging="360"/>
+      </w:pPr>
+    </w:lvl>
+    <w:lvl w:ilvl="8" w:tentative="1">
+      <w:start w:val="1"/>
+      <w:numFmt w:val="decimal"/>
+      <w:lvlText w:val="%9."/>
+      <w:lvlJc w:val="left"/>
+      <w:pPr>
+        <w:tabs>
+          <w:tab w:val="num" w:pos="6480"/>
+        </w:tabs>
+        <w:ind w:left="6480" w:hanging="360"/>
+      </w:pPr>
+    </w:lvl>
+  </w:abstractNum>
+  <w:abstractNum w:abstractNumId="2" w15:restartNumberingAfterBreak="0">
     <w:nsid w:val="0612067E"/>
     <w:multiLevelType w:val="multilevel"/>
     <w:tmpl w:val="7F5EBF84"/>
@@ -15186,7 +16517,7 @@
       </w:rPr>
     </w:lvl>
   </w:abstractNum>
-  <w:abstractNum w:abstractNumId="2" w15:restartNumberingAfterBreak="0">
+  <w:abstractNum w:abstractNumId="3" w15:restartNumberingAfterBreak="0">
     <w:nsid w:val="06C0154A"/>
     <w:multiLevelType w:val="multilevel"/>
     <w:tmpl w:val="DEACF4A6"/>
@@ -15335,7 +16666,7 @@
       </w:rPr>
     </w:lvl>
   </w:abstractNum>
-  <w:abstractNum w:abstractNumId="3" w15:restartNumberingAfterBreak="0">
+  <w:abstractNum w:abstractNumId="4" w15:restartNumberingAfterBreak="0">
     <w:nsid w:val="09E11FF4"/>
     <w:multiLevelType w:val="multilevel"/>
     <w:tmpl w:val="18EEE0E8"/>
@@ -15484,7 +16815,7 @@
       </w:rPr>
     </w:lvl>
   </w:abstractNum>
-  <w:abstractNum w:abstractNumId="4" w15:restartNumberingAfterBreak="0">
+  <w:abstractNum w:abstractNumId="5" w15:restartNumberingAfterBreak="0">
     <w:nsid w:val="0BF1555C"/>
     <w:multiLevelType w:val="multilevel"/>
     <w:tmpl w:val="DEACF4A6"/>
@@ -15633,7 +16964,156 @@
       </w:rPr>
     </w:lvl>
   </w:abstractNum>
-  <w:abstractNum w:abstractNumId="5" w15:restartNumberingAfterBreak="0">
+  <w:abstractNum w:abstractNumId="6" w15:restartNumberingAfterBreak="0">
+    <w:nsid w:val="0DBD2EF1"/>
+    <w:multiLevelType w:val="multilevel"/>
+    <w:tmpl w:val="FFBA11F8"/>
+    <w:lvl w:ilvl="0">
+      <w:start w:val="1"/>
+      <w:numFmt w:val="bullet"/>
+      <w:lvlText w:val=""/>
+      <w:lvlJc w:val="left"/>
+      <w:pPr>
+        <w:tabs>
+          <w:tab w:val="num" w:pos="720"/>
+        </w:tabs>
+        <w:ind w:left="720" w:hanging="360"/>
+      </w:pPr>
+      <w:rPr>
+        <w:rFonts w:ascii="Symbol" w:hAnsi="Symbol" w:hint="default"/>
+        <w:sz w:val="20"/>
+      </w:rPr>
+    </w:lvl>
+    <w:lvl w:ilvl="1">
+      <w:start w:val="1"/>
+      <w:numFmt w:val="bullet"/>
+      <w:lvlText w:val="o"/>
+      <w:lvlJc w:val="left"/>
+      <w:pPr>
+        <w:tabs>
+          <w:tab w:val="num" w:pos="1440"/>
+        </w:tabs>
+        <w:ind w:left="1440" w:hanging="360"/>
+      </w:pPr>
+      <w:rPr>
+        <w:rFonts w:ascii="Courier New" w:hAnsi="Courier New" w:hint="default"/>
+        <w:sz w:val="20"/>
+      </w:rPr>
+    </w:lvl>
+    <w:lvl w:ilvl="2" w:tentative="1">
+      <w:start w:val="1"/>
+      <w:numFmt w:val="bullet"/>
+      <w:lvlText w:val=""/>
+      <w:lvlJc w:val="left"/>
+      <w:pPr>
+        <w:tabs>
+          <w:tab w:val="num" w:pos="2160"/>
+        </w:tabs>
+        <w:ind w:left="2160" w:hanging="360"/>
+      </w:pPr>
+      <w:rPr>
+        <w:rFonts w:ascii="Wingdings" w:hAnsi="Wingdings" w:hint="default"/>
+        <w:sz w:val="20"/>
+      </w:rPr>
+    </w:lvl>
+    <w:lvl w:ilvl="3" w:tentative="1">
+      <w:start w:val="1"/>
+      <w:numFmt w:val="bullet"/>
+      <w:lvlText w:val=""/>
+      <w:lvlJc w:val="left"/>
+      <w:pPr>
+        <w:tabs>
+          <w:tab w:val="num" w:pos="2880"/>
+        </w:tabs>
+        <w:ind w:left="2880" w:hanging="360"/>
+      </w:pPr>
+      <w:rPr>
+        <w:rFonts w:ascii="Wingdings" w:hAnsi="Wingdings" w:hint="default"/>
+        <w:sz w:val="20"/>
+      </w:rPr>
+    </w:lvl>
+    <w:lvl w:ilvl="4" w:tentative="1">
+      <w:start w:val="1"/>
+      <w:numFmt w:val="bullet"/>
+      <w:lvlText w:val=""/>
+      <w:lvlJc w:val="left"/>
+      <w:pPr>
+        <w:tabs>
+          <w:tab w:val="num" w:pos="3600"/>
+        </w:tabs>
+        <w:ind w:left="3600" w:hanging="360"/>
+      </w:pPr>
+      <w:rPr>
+        <w:rFonts w:ascii="Wingdings" w:hAnsi="Wingdings" w:hint="default"/>
+        <w:sz w:val="20"/>
+      </w:rPr>
+    </w:lvl>
+    <w:lvl w:ilvl="5" w:tentative="1">
+      <w:start w:val="1"/>
+      <w:numFmt w:val="bullet"/>
+      <w:lvlText w:val=""/>
+      <w:lvlJc w:val="left"/>
+      <w:pPr>
+        <w:tabs>
+          <w:tab w:val="num" w:pos="4320"/>
+        </w:tabs>
+        <w:ind w:left="4320" w:hanging="360"/>
+      </w:pPr>
+      <w:rPr>
+        <w:rFonts w:ascii="Wingdings" w:hAnsi="Wingdings" w:hint="default"/>
+        <w:sz w:val="20"/>
+      </w:rPr>
+    </w:lvl>
+    <w:lvl w:ilvl="6" w:tentative="1">
+      <w:start w:val="1"/>
+      <w:numFmt w:val="bullet"/>
+      <w:lvlText w:val=""/>
+      <w:lvlJc w:val="left"/>
+      <w:pPr>
+        <w:tabs>
+          <w:tab w:val="num" w:pos="5040"/>
+        </w:tabs>
+        <w:ind w:left="5040" w:hanging="360"/>
+      </w:pPr>
+      <w:rPr>
+        <w:rFonts w:ascii="Wingdings" w:hAnsi="Wingdings" w:hint="default"/>
+        <w:sz w:val="20"/>
+      </w:rPr>
+    </w:lvl>
+    <w:lvl w:ilvl="7" w:tentative="1">
+      <w:start w:val="1"/>
+      <w:numFmt w:val="bullet"/>
+      <w:lvlText w:val=""/>
+      <w:lvlJc w:val="left"/>
+      <w:pPr>
+        <w:tabs>
+          <w:tab w:val="num" w:pos="5760"/>
+        </w:tabs>
+        <w:ind w:left="5760" w:hanging="360"/>
+      </w:pPr>
+      <w:rPr>
+        <w:rFonts w:ascii="Wingdings" w:hAnsi="Wingdings" w:hint="default"/>
+        <w:sz w:val="20"/>
+      </w:rPr>
+    </w:lvl>
+    <w:lvl w:ilvl="8" w:tentative="1">
+      <w:start w:val="1"/>
+      <w:numFmt w:val="bullet"/>
+      <w:lvlText w:val=""/>
+      <w:lvlJc w:val="left"/>
+      <w:pPr>
+        <w:tabs>
+          <w:tab w:val="num" w:pos="6480"/>
+        </w:tabs>
+        <w:ind w:left="6480" w:hanging="360"/>
+      </w:pPr>
+      <w:rPr>
+        <w:rFonts w:ascii="Wingdings" w:hAnsi="Wingdings" w:hint="default"/>
+        <w:sz w:val="20"/>
+      </w:rPr>
+    </w:lvl>
+  </w:abstractNum>
+  <w:abstractNum w:abstractNumId="7" w15:restartNumberingAfterBreak="0">
     <w:nsid w:val="12C53EB4"/>
     <w:multiLevelType w:val="multilevel"/>
     <w:tmpl w:val="75CA594A"/>
@@ -15782,7 +17262,7 @@
       </w:rPr>
     </w:lvl>
   </w:abstractNum>
-  <w:abstractNum w:abstractNumId="6" w15:restartNumberingAfterBreak="0">
+  <w:abstractNum w:abstractNumId="8" w15:restartNumberingAfterBreak="0">
     <w:nsid w:val="15FF1803"/>
     <w:multiLevelType w:val="multilevel"/>
     <w:tmpl w:val="DEACF4A6"/>
@@ -15931,7 +17411,7 @@
       </w:rPr>
     </w:lvl>
   </w:abstractNum>
-  <w:abstractNum w:abstractNumId="7" w15:restartNumberingAfterBreak="0">
+  <w:abstractNum w:abstractNumId="9" w15:restartNumberingAfterBreak="0">
     <w:nsid w:val="171F436E"/>
     <w:multiLevelType w:val="multilevel"/>
     <w:tmpl w:val="0FBE3394"/>
@@ -16076,7 +17556,7 @@
       </w:rPr>
     </w:lvl>
   </w:abstractNum>
-  <w:abstractNum w:abstractNumId="8" w15:restartNumberingAfterBreak="0">
+  <w:abstractNum w:abstractNumId="10" w15:restartNumberingAfterBreak="0">
     <w:nsid w:val="19645888"/>
     <w:multiLevelType w:val="multilevel"/>
     <w:tmpl w:val="DEACF4A6"/>
@@ -16225,7 +17705,7 @@
       </w:rPr>
     </w:lvl>
   </w:abstractNum>
-  <w:abstractNum w:abstractNumId="9" w15:restartNumberingAfterBreak="0">
+  <w:abstractNum w:abstractNumId="11" w15:restartNumberingAfterBreak="0">
     <w:nsid w:val="1AC6521F"/>
     <w:multiLevelType w:val="multilevel"/>
     <w:tmpl w:val="679E7DAE"/>
@@ -16374,7 +17854,7 @@
       </w:rPr>
     </w:lvl>
   </w:abstractNum>
-  <w:abstractNum w:abstractNumId="10" w15:restartNumberingAfterBreak="0">
+  <w:abstractNum w:abstractNumId="12" w15:restartNumberingAfterBreak="0">
     <w:nsid w:val="1B2337FC"/>
     <w:multiLevelType w:val="multilevel"/>
     <w:tmpl w:val="EE1E8AAA"/>
@@ -16523,7 +18003,7 @@
       </w:rPr>
     </w:lvl>
   </w:abstractNum>
-  <w:abstractNum w:abstractNumId="11" w15:restartNumberingAfterBreak="0">
+  <w:abstractNum w:abstractNumId="13" w15:restartNumberingAfterBreak="0">
     <w:nsid w:val="1B704BCC"/>
     <w:multiLevelType w:val="multilevel"/>
     <w:tmpl w:val="411C34E2"/>
@@ -16672,10 +18152,10 @@
       </w:rPr>
     </w:lvl>
   </w:abstractNum>
-  <w:abstractNum w:abstractNumId="12" w15:restartNumberingAfterBreak="0">
+  <w:abstractNum w:abstractNumId="14" w15:restartNumberingAfterBreak="0">
     <w:nsid w:val="1B9A1027"/>
     <w:multiLevelType w:val="multilevel"/>
-    <w:tmpl w:val="58402490"/>
+    <w:tmpl w:val="08E6C22E"/>
     <w:lvl w:ilvl="0">
       <w:start w:val="1"/>
       <w:numFmt w:val="bullet"/>
@@ -16822,7 +18302,7 @@
       </w:rPr>
     </w:lvl>
   </w:abstractNum>
-  <w:abstractNum w:abstractNumId="13" w15:restartNumberingAfterBreak="0">
+  <w:abstractNum w:abstractNumId="15" w15:restartNumberingAfterBreak="0">
     <w:nsid w:val="1E6F4149"/>
     <w:multiLevelType w:val="multilevel"/>
     <w:tmpl w:val="A814AD70"/>
@@ -16971,7 +18451,7 @@
       </w:rPr>
     </w:lvl>
   </w:abstractNum>
-  <w:abstractNum w:abstractNumId="14" w15:restartNumberingAfterBreak="0">
+  <w:abstractNum w:abstractNumId="16" w15:restartNumberingAfterBreak="0">
     <w:nsid w:val="20DE0FED"/>
     <w:multiLevelType w:val="multilevel"/>
     <w:tmpl w:val="DEACF4A6"/>
@@ -17120,7 +18600,7 @@
       </w:rPr>
     </w:lvl>
   </w:abstractNum>
-  <w:abstractNum w:abstractNumId="15" w15:restartNumberingAfterBreak="0">
+  <w:abstractNum w:abstractNumId="17" w15:restartNumberingAfterBreak="0">
     <w:nsid w:val="22CE6FCA"/>
     <w:multiLevelType w:val="multilevel"/>
     <w:tmpl w:val="DEACF4A6"/>
@@ -17269,7 +18749,156 @@
       </w:rPr>
     </w:lvl>
   </w:abstractNum>
-  <w:abstractNum w:abstractNumId="16" w15:restartNumberingAfterBreak="0">
+  <w:abstractNum w:abstractNumId="18" w15:restartNumberingAfterBreak="0">
+    <w:nsid w:val="22CF1E15"/>
+    <w:multiLevelType w:val="multilevel"/>
+    <w:tmpl w:val="931E716C"/>
+    <w:lvl w:ilvl="0">
+      <w:start w:val="1"/>
+      <w:numFmt w:val="bullet"/>
+      <w:lvlText w:val=""/>
+      <w:lvlJc w:val="left"/>
+      <w:pPr>
+        <w:tabs>
+          <w:tab w:val="num" w:pos="720"/>
+        </w:tabs>
+        <w:ind w:left="720" w:hanging="360"/>
+      </w:pPr>
+      <w:rPr>
+        <w:rFonts w:ascii="Symbol" w:hAnsi="Symbol" w:hint="default"/>
+        <w:sz w:val="20"/>
+      </w:rPr>
+    </w:lvl>
+    <w:lvl w:ilvl="1" w:tentative="1">
+      <w:start w:val="1"/>
+      <w:numFmt w:val="bullet"/>
+      <w:lvlText w:val="o"/>
+      <w:lvlJc w:val="left"/>
+      <w:pPr>
+        <w:tabs>
+          <w:tab w:val="num" w:pos="1440"/>
+        </w:tabs>
+        <w:ind w:left="1440" w:hanging="360"/>
+      </w:pPr>
+      <w:rPr>
+        <w:rFonts w:ascii="Courier New" w:hAnsi="Courier New" w:hint="default"/>
+        <w:sz w:val="20"/>
+      </w:rPr>
+    </w:lvl>
+    <w:lvl w:ilvl="2" w:tentative="1">
+      <w:start w:val="1"/>
+      <w:numFmt w:val="bullet"/>
+      <w:lvlText w:val=""/>
+      <w:lvlJc w:val="left"/>
+      <w:pPr>
+        <w:tabs>
+          <w:tab w:val="num" w:pos="2160"/>
+        </w:tabs>
+        <w:ind w:left="2160" w:hanging="360"/>
+      </w:pPr>
+      <w:rPr>
+        <w:rFonts w:ascii="Wingdings" w:hAnsi="Wingdings" w:hint="default"/>
+        <w:sz w:val="20"/>
+      </w:rPr>
+    </w:lvl>
+    <w:lvl w:ilvl="3" w:tentative="1">
+      <w:start w:val="1"/>
+      <w:numFmt w:val="bullet"/>
+      <w:lvlText w:val=""/>
+      <w:lvlJc w:val="left"/>
+      <w:pPr>
+        <w:tabs>
+          <w:tab w:val="num" w:pos="2880"/>
+        </w:tabs>
+        <w:ind w:left="2880" w:hanging="360"/>
+      </w:pPr>
+      <w:rPr>
+        <w:rFonts w:ascii="Wingdings" w:hAnsi="Wingdings" w:hint="default"/>
+        <w:sz w:val="20"/>
+      </w:rPr>
+    </w:lvl>
+    <w:lvl w:ilvl="4" w:tentative="1">
+      <w:start w:val="1"/>
+      <w:numFmt w:val="bullet"/>
+      <w:lvlText w:val=""/>
+      <w:lvlJc w:val="left"/>
+      <w:pPr>
+        <w:tabs>
+          <w:tab w:val="num" w:pos="3600"/>
+        </w:tabs>
+        <w:ind w:left="3600" w:hanging="360"/>
+      </w:pPr>
+      <w:rPr>
+        <w:rFonts w:ascii="Wingdings" w:hAnsi="Wingdings" w:hint="default"/>
+        <w:sz w:val="20"/>
+      </w:rPr>
+    </w:lvl>
+    <w:lvl w:ilvl="5" w:tentative="1">
+      <w:start w:val="1"/>
+      <w:numFmt w:val="bullet"/>
+      <w:lvlText w:val=""/>
+      <w:lvlJc w:val="left"/>
+      <w:pPr>
+        <w:tabs>
+          <w:tab w:val="num" w:pos="4320"/>
+        </w:tabs>
+        <w:ind w:left="4320" w:hanging="360"/>
+      </w:pPr>
+      <w:rPr>
+        <w:rFonts w:ascii="Wingdings" w:hAnsi="Wingdings" w:hint="default"/>
+        <w:sz w:val="20"/>
+      </w:rPr>
+    </w:lvl>
+    <w:lvl w:ilvl="6" w:tentative="1">
+      <w:start w:val="1"/>
+      <w:numFmt w:val="bullet"/>
+      <w:lvlText w:val=""/>
+      <w:lvlJc w:val="left"/>
+      <w:pPr>
+        <w:tabs>
+          <w:tab w:val="num" w:pos="5040"/>
+        </w:tabs>
+        <w:ind w:left="5040" w:hanging="360"/>
+      </w:pPr>
+      <w:rPr>
+        <w:rFonts w:ascii="Wingdings" w:hAnsi="Wingdings" w:hint="default"/>
+        <w:sz w:val="20"/>
+      </w:rPr>
+    </w:lvl>
+    <w:lvl w:ilvl="7" w:tentative="1">
+      <w:start w:val="1"/>
+      <w:numFmt w:val="bullet"/>
+      <w:lvlText w:val=""/>
+      <w:lvlJc w:val="left"/>
+      <w:pPr>
+        <w:tabs>
+          <w:tab w:val="num" w:pos="5760"/>
+        </w:tabs>
+        <w:ind w:left="5760" w:hanging="360"/>
+      </w:pPr>
+      <w:rPr>
+        <w:rFonts w:ascii="Wingdings" w:hAnsi="Wingdings" w:hint="default"/>
+        <w:sz w:val="20"/>
+      </w:rPr>
+    </w:lvl>
+    <w:lvl w:ilvl="8" w:tentative="1">
+      <w:start w:val="1"/>
+      <w:numFmt w:val="bullet"/>
+      <w:lvlText w:val=""/>
+      <w:lvlJc w:val="left"/>
+      <w:pPr>
+        <w:tabs>
+          <w:tab w:val="num" w:pos="6480"/>
+        </w:tabs>
+        <w:ind w:left="6480" w:hanging="360"/>
+      </w:pPr>
+      <w:rPr>
+        <w:rFonts w:ascii="Wingdings" w:hAnsi="Wingdings" w:hint="default"/>
+        <w:sz w:val="20"/>
+      </w:rPr>
+    </w:lvl>
+  </w:abstractNum>
+  <w:abstractNum w:abstractNumId="19" w15:restartNumberingAfterBreak="0">
     <w:nsid w:val="26827C40"/>
     <w:multiLevelType w:val="multilevel"/>
     <w:tmpl w:val="DEE4812C"/>
@@ -17418,7 +19047,7 @@
       </w:rPr>
     </w:lvl>
   </w:abstractNum>
-  <w:abstractNum w:abstractNumId="17" w15:restartNumberingAfterBreak="0">
+  <w:abstractNum w:abstractNumId="20" w15:restartNumberingAfterBreak="0">
     <w:nsid w:val="28EA590F"/>
     <w:multiLevelType w:val="multilevel"/>
     <w:tmpl w:val="C2C0C1E4"/>
@@ -17567,7 +19196,7 @@
       </w:rPr>
     </w:lvl>
   </w:abstractNum>
-  <w:abstractNum w:abstractNumId="18" w15:restartNumberingAfterBreak="0">
+  <w:abstractNum w:abstractNumId="21" w15:restartNumberingAfterBreak="0">
     <w:nsid w:val="2B2A2EBC"/>
     <w:multiLevelType w:val="multilevel"/>
     <w:tmpl w:val="DEACF4A6"/>
@@ -17716,7 +19345,156 @@
       </w:rPr>
     </w:lvl>
   </w:abstractNum>
-  <w:abstractNum w:abstractNumId="19" w15:restartNumberingAfterBreak="0">
+  <w:abstractNum w:abstractNumId="22" w15:restartNumberingAfterBreak="0">
+    <w:nsid w:val="2C4A5A7A"/>
+    <w:multiLevelType w:val="multilevel"/>
+    <w:tmpl w:val="A5CC0528"/>
+    <w:lvl w:ilvl="0">
+      <w:start w:val="1"/>
+      <w:numFmt w:val="bullet"/>
+      <w:lvlText w:val=""/>
+      <w:lvlJc w:val="left"/>
+      <w:pPr>
+        <w:tabs>
+          <w:tab w:val="num" w:pos="720"/>
+        </w:tabs>
+        <w:ind w:left="720" w:hanging="360"/>
+      </w:pPr>
+      <w:rPr>
+        <w:rFonts w:ascii="Symbol" w:hAnsi="Symbol" w:hint="default"/>
+        <w:sz w:val="20"/>
+      </w:rPr>
+    </w:lvl>
+    <w:lvl w:ilvl="1" w:tentative="1">
+      <w:start w:val="1"/>
+      <w:numFmt w:val="bullet"/>
+      <w:lvlText w:val="o"/>
+      <w:lvlJc w:val="left"/>
+      <w:pPr>
+        <w:tabs>
+          <w:tab w:val="num" w:pos="1440"/>
+        </w:tabs>
+        <w:ind w:left="1440" w:hanging="360"/>
+      </w:pPr>
+      <w:rPr>
+        <w:rFonts w:ascii="Courier New" w:hAnsi="Courier New" w:hint="default"/>
+        <w:sz w:val="20"/>
+      </w:rPr>
+    </w:lvl>
+    <w:lvl w:ilvl="2" w:tentative="1">
+      <w:start w:val="1"/>
+      <w:numFmt w:val="bullet"/>
+      <w:lvlText w:val=""/>
+      <w:lvlJc w:val="left"/>
+      <w:pPr>
+        <w:tabs>
+          <w:tab w:val="num" w:pos="2160"/>
+        </w:tabs>
+        <w:ind w:left="2160" w:hanging="360"/>
+      </w:pPr>
+      <w:rPr>
+        <w:rFonts w:ascii="Wingdings" w:hAnsi="Wingdings" w:hint="default"/>
+        <w:sz w:val="20"/>
+      </w:rPr>
+    </w:lvl>
+    <w:lvl w:ilvl="3" w:tentative="1">
+      <w:start w:val="1"/>
+      <w:numFmt w:val="bullet"/>
+      <w:lvlText w:val=""/>
+      <w:lvlJc w:val="left"/>
+      <w:pPr>
+        <w:tabs>
+          <w:tab w:val="num" w:pos="2880"/>
+        </w:tabs>
+        <w:ind w:left="2880" w:hanging="360"/>
+      </w:pPr>
+      <w:rPr>
+        <w:rFonts w:ascii="Wingdings" w:hAnsi="Wingdings" w:hint="default"/>
+        <w:sz w:val="20"/>
+      </w:rPr>
+    </w:lvl>
+    <w:lvl w:ilvl="4" w:tentative="1">
+      <w:start w:val="1"/>
+      <w:numFmt w:val="bullet"/>
+      <w:lvlText w:val=""/>
+      <w:lvlJc w:val="left"/>
+      <w:pPr>
+        <w:tabs>
+          <w:tab w:val="num" w:pos="3600"/>
+        </w:tabs>
+        <w:ind w:left="3600" w:hanging="360"/>
+      </w:pPr>
+      <w:rPr>
+        <w:rFonts w:ascii="Wingdings" w:hAnsi="Wingdings" w:hint="default"/>
+        <w:sz w:val="20"/>
+      </w:rPr>
+    </w:lvl>
+    <w:lvl w:ilvl="5" w:tentative="1">
+      <w:start w:val="1"/>
+      <w:numFmt w:val="bullet"/>
+      <w:lvlText w:val=""/>
+      <w:lvlJc w:val="left"/>
+      <w:pPr>
+        <w:tabs>
+          <w:tab w:val="num" w:pos="4320"/>
+        </w:tabs>
+        <w:ind w:left="4320" w:hanging="360"/>
+      </w:pPr>
+      <w:rPr>
+        <w:rFonts w:ascii="Wingdings" w:hAnsi="Wingdings" w:hint="default"/>
+        <w:sz w:val="20"/>
+      </w:rPr>
+    </w:lvl>
+    <w:lvl w:ilvl="6" w:tentative="1">
+      <w:start w:val="1"/>
+      <w:numFmt w:val="bullet"/>
+      <w:lvlText w:val=""/>
+      <w:lvlJc w:val="left"/>
+      <w:pPr>
+        <w:tabs>
+          <w:tab w:val="num" w:pos="5040"/>
+        </w:tabs>
+        <w:ind w:left="5040" w:hanging="360"/>
+      </w:pPr>
+      <w:rPr>
+        <w:rFonts w:ascii="Wingdings" w:hAnsi="Wingdings" w:hint="default"/>
+        <w:sz w:val="20"/>
+      </w:rPr>
+    </w:lvl>
+    <w:lvl w:ilvl="7" w:tentative="1">
+      <w:start w:val="1"/>
+      <w:numFmt w:val="bullet"/>
+      <w:lvlText w:val=""/>
+      <w:lvlJc w:val="left"/>
+      <w:pPr>
+        <w:tabs>
+          <w:tab w:val="num" w:pos="5760"/>
+        </w:tabs>
+        <w:ind w:left="5760" w:hanging="360"/>
+      </w:pPr>
+      <w:rPr>
+        <w:rFonts w:ascii="Wingdings" w:hAnsi="Wingdings" w:hint="default"/>
+        <w:sz w:val="20"/>
+      </w:rPr>
+    </w:lvl>
+    <w:lvl w:ilvl="8" w:tentative="1">
+      <w:start w:val="1"/>
+      <w:numFmt w:val="bullet"/>
+      <w:lvlText w:val=""/>
+      <w:lvlJc w:val="left"/>
+      <w:pPr>
+        <w:tabs>
+          <w:tab w:val="num" w:pos="6480"/>
+        </w:tabs>
+        <w:ind w:left="6480" w:hanging="360"/>
+      </w:pPr>
+      <w:rPr>
+        <w:rFonts w:ascii="Wingdings" w:hAnsi="Wingdings" w:hint="default"/>
+        <w:sz w:val="20"/>
+      </w:rPr>
+    </w:lvl>
+  </w:abstractNum>
+  <w:abstractNum w:abstractNumId="23" w15:restartNumberingAfterBreak="0">
     <w:nsid w:val="2F8C5BC2"/>
     <w:multiLevelType w:val="multilevel"/>
     <w:tmpl w:val="DEACF4A6"/>
@@ -17865,7 +19643,156 @@
       </w:rPr>
     </w:lvl>
   </w:abstractNum>
-  <w:abstractNum w:abstractNumId="20" w15:restartNumberingAfterBreak="0">
+  <w:abstractNum w:abstractNumId="24" w15:restartNumberingAfterBreak="0">
+    <w:nsid w:val="2FA509C5"/>
+    <w:multiLevelType w:val="multilevel"/>
+    <w:tmpl w:val="DE24BE4C"/>
+    <w:lvl w:ilvl="0">
+      <w:start w:val="1"/>
+      <w:numFmt w:val="bullet"/>
+      <w:lvlText w:val=""/>
+      <w:lvlJc w:val="left"/>
+      <w:pPr>
+        <w:tabs>
+          <w:tab w:val="num" w:pos="720"/>
+        </w:tabs>
+        <w:ind w:left="720" w:hanging="360"/>
+      </w:pPr>
+      <w:rPr>
+        <w:rFonts w:ascii="Symbol" w:hAnsi="Symbol" w:hint="default"/>
+        <w:sz w:val="20"/>
+      </w:rPr>
+    </w:lvl>
+    <w:lvl w:ilvl="1">
+      <w:start w:val="1"/>
+      <w:numFmt w:val="bullet"/>
+      <w:lvlText w:val="o"/>
+      <w:lvlJc w:val="left"/>
+      <w:pPr>
+        <w:tabs>
+          <w:tab w:val="num" w:pos="1440"/>
+        </w:tabs>
+        <w:ind w:left="1440" w:hanging="360"/>
+      </w:pPr>
+      <w:rPr>
+        <w:rFonts w:ascii="Courier New" w:hAnsi="Courier New" w:hint="default"/>
+        <w:sz w:val="20"/>
+      </w:rPr>
+    </w:lvl>
+    <w:lvl w:ilvl="2" w:tentative="1">
+      <w:start w:val="1"/>
+      <w:numFmt w:val="bullet"/>
+      <w:lvlText w:val=""/>
+      <w:lvlJc w:val="left"/>
+      <w:pPr>
+        <w:tabs>
+          <w:tab w:val="num" w:pos="2160"/>
+        </w:tabs>
+        <w:ind w:left="2160" w:hanging="360"/>
+      </w:pPr>
+      <w:rPr>
+        <w:rFonts w:ascii="Wingdings" w:hAnsi="Wingdings" w:hint="default"/>
+        <w:sz w:val="20"/>
+      </w:rPr>
+    </w:lvl>
+    <w:lvl w:ilvl="3" w:tentative="1">
+      <w:start w:val="1"/>
+      <w:numFmt w:val="bullet"/>
+      <w:lvlText w:val=""/>
+      <w:lvlJc w:val="left"/>
+      <w:pPr>
+        <w:tabs>
+          <w:tab w:val="num" w:pos="2880"/>
+        </w:tabs>
+        <w:ind w:left="2880" w:hanging="360"/>
+      </w:pPr>
+      <w:rPr>
+        <w:rFonts w:ascii="Wingdings" w:hAnsi="Wingdings" w:hint="default"/>
+        <w:sz w:val="20"/>
+      </w:rPr>
+    </w:lvl>
+    <w:lvl w:ilvl="4" w:tentative="1">
+      <w:start w:val="1"/>
+      <w:numFmt w:val="bullet"/>
+      <w:lvlText w:val=""/>
+      <w:lvlJc w:val="left"/>
+      <w:pPr>
+        <w:tabs>
+          <w:tab w:val="num" w:pos="3600"/>
+        </w:tabs>
+        <w:ind w:left="3600" w:hanging="360"/>
+      </w:pPr>
+      <w:rPr>
+        <w:rFonts w:ascii="Wingdings" w:hAnsi="Wingdings" w:hint="default"/>
+        <w:sz w:val="20"/>
+      </w:rPr>
+    </w:lvl>
+    <w:lvl w:ilvl="5" w:tentative="1">
+      <w:start w:val="1"/>
+      <w:numFmt w:val="bullet"/>
+      <w:lvlText w:val=""/>
+      <w:lvlJc w:val="left"/>
+      <w:pPr>
+        <w:tabs>
+          <w:tab w:val="num" w:pos="4320"/>
+        </w:tabs>
+        <w:ind w:left="4320" w:hanging="360"/>
+      </w:pPr>
+      <w:rPr>
+        <w:rFonts w:ascii="Wingdings" w:hAnsi="Wingdings" w:hint="default"/>
+        <w:sz w:val="20"/>
+      </w:rPr>
+    </w:lvl>
+    <w:lvl w:ilvl="6" w:tentative="1">
+      <w:start w:val="1"/>
+      <w:numFmt w:val="bullet"/>
+      <w:lvlText w:val=""/>
+      <w:lvlJc w:val="left"/>
+      <w:pPr>
+        <w:tabs>
+          <w:tab w:val="num" w:pos="5040"/>
+        </w:tabs>
+        <w:ind w:left="5040" w:hanging="360"/>
+      </w:pPr>
+      <w:rPr>
+        <w:rFonts w:ascii="Wingdings" w:hAnsi="Wingdings" w:hint="default"/>
+        <w:sz w:val="20"/>
+      </w:rPr>
+    </w:lvl>
+    <w:lvl w:ilvl="7" w:tentative="1">
+      <w:start w:val="1"/>
+      <w:numFmt w:val="bullet"/>
+      <w:lvlText w:val=""/>
+      <w:lvlJc w:val="left"/>
+      <w:pPr>
+        <w:tabs>
+          <w:tab w:val="num" w:pos="5760"/>
+        </w:tabs>
+        <w:ind w:left="5760" w:hanging="360"/>
+      </w:pPr>
+      <w:rPr>
+        <w:rFonts w:ascii="Wingdings" w:hAnsi="Wingdings" w:hint="default"/>
+        <w:sz w:val="20"/>
+      </w:rPr>
+    </w:lvl>
+    <w:lvl w:ilvl="8" w:tentative="1">
+      <w:start w:val="1"/>
+      <w:numFmt w:val="bullet"/>
+      <w:lvlText w:val=""/>
+      <w:lvlJc w:val="left"/>
+      <w:pPr>
+        <w:tabs>
+          <w:tab w:val="num" w:pos="6480"/>
+        </w:tabs>
+        <w:ind w:left="6480" w:hanging="360"/>
+      </w:pPr>
+      <w:rPr>
+        <w:rFonts w:ascii="Wingdings" w:hAnsi="Wingdings" w:hint="default"/>
+        <w:sz w:val="20"/>
+      </w:rPr>
+    </w:lvl>
+  </w:abstractNum>
+  <w:abstractNum w:abstractNumId="25" w15:restartNumberingAfterBreak="0">
     <w:nsid w:val="31A015CF"/>
     <w:multiLevelType w:val="multilevel"/>
     <w:tmpl w:val="BC7095D8"/>
@@ -17978,7 +19905,156 @@
       </w:pPr>
     </w:lvl>
   </w:abstractNum>
-  <w:abstractNum w:abstractNumId="21" w15:restartNumberingAfterBreak="0">
+  <w:abstractNum w:abstractNumId="26" w15:restartNumberingAfterBreak="0">
+    <w:nsid w:val="331275C6"/>
+    <w:multiLevelType w:val="multilevel"/>
+    <w:tmpl w:val="E4FC5D1A"/>
+    <w:lvl w:ilvl="0">
+      <w:start w:val="1"/>
+      <w:numFmt w:val="bullet"/>
+      <w:lvlText w:val=""/>
+      <w:lvlJc w:val="left"/>
+      <w:pPr>
+        <w:tabs>
+          <w:tab w:val="num" w:pos="720"/>
+        </w:tabs>
+        <w:ind w:left="720" w:hanging="360"/>
+      </w:pPr>
+      <w:rPr>
+        <w:rFonts w:ascii="Symbol" w:hAnsi="Symbol" w:hint="default"/>
+        <w:sz w:val="20"/>
+      </w:rPr>
+    </w:lvl>
+    <w:lvl w:ilvl="1" w:tentative="1">
+      <w:start w:val="1"/>
+      <w:numFmt w:val="bullet"/>
+      <w:lvlText w:val="o"/>
+      <w:lvlJc w:val="left"/>
+      <w:pPr>
+        <w:tabs>
+          <w:tab w:val="num" w:pos="1440"/>
+        </w:tabs>
+        <w:ind w:left="1440" w:hanging="360"/>
+      </w:pPr>
+      <w:rPr>
+        <w:rFonts w:ascii="Courier New" w:hAnsi="Courier New" w:hint="default"/>
+        <w:sz w:val="20"/>
+      </w:rPr>
+    </w:lvl>
+    <w:lvl w:ilvl="2" w:tentative="1">
+      <w:start w:val="1"/>
+      <w:numFmt w:val="bullet"/>
+      <w:lvlText w:val=""/>
+      <w:lvlJc w:val="left"/>
+      <w:pPr>
+        <w:tabs>
+          <w:tab w:val="num" w:pos="2160"/>
+        </w:tabs>
+        <w:ind w:left="2160" w:hanging="360"/>
+      </w:pPr>
+      <w:rPr>
+        <w:rFonts w:ascii="Wingdings" w:hAnsi="Wingdings" w:hint="default"/>
+        <w:sz w:val="20"/>
+      </w:rPr>
+    </w:lvl>
+    <w:lvl w:ilvl="3" w:tentative="1">
+      <w:start w:val="1"/>
+      <w:numFmt w:val="bullet"/>
+      <w:lvlText w:val=""/>
+      <w:lvlJc w:val="left"/>
+      <w:pPr>
+        <w:tabs>
+          <w:tab w:val="num" w:pos="2880"/>
+        </w:tabs>
+        <w:ind w:left="2880" w:hanging="360"/>
+      </w:pPr>
+      <w:rPr>
+        <w:rFonts w:ascii="Wingdings" w:hAnsi="Wingdings" w:hint="default"/>
+        <w:sz w:val="20"/>
+      </w:rPr>
+    </w:lvl>
+    <w:lvl w:ilvl="4" w:tentative="1">
+      <w:start w:val="1"/>
+      <w:numFmt w:val="bullet"/>
+      <w:lvlText w:val=""/>
+      <w:lvlJc w:val="left"/>
+      <w:pPr>
+        <w:tabs>
+          <w:tab w:val="num" w:pos="3600"/>
+        </w:tabs>
+        <w:ind w:left="3600" w:hanging="360"/>
+      </w:pPr>
+      <w:rPr>
+        <w:rFonts w:ascii="Wingdings" w:hAnsi="Wingdings" w:hint="default"/>
+        <w:sz w:val="20"/>
+      </w:rPr>
+    </w:lvl>
+    <w:lvl w:ilvl="5" w:tentative="1">
+      <w:start w:val="1"/>
+      <w:numFmt w:val="bullet"/>
+      <w:lvlText w:val=""/>
+      <w:lvlJc w:val="left"/>
+      <w:pPr>
+        <w:tabs>
+          <w:tab w:val="num" w:pos="4320"/>
+        </w:tabs>
+        <w:ind w:left="4320" w:hanging="360"/>
+      </w:pPr>
+      <w:rPr>
+        <w:rFonts w:ascii="Wingdings" w:hAnsi="Wingdings" w:hint="default"/>
+        <w:sz w:val="20"/>
+      </w:rPr>
+    </w:lvl>
+    <w:lvl w:ilvl="6" w:tentative="1">
+      <w:start w:val="1"/>
+      <w:numFmt w:val="bullet"/>
+      <w:lvlText w:val=""/>
+      <w:lvlJc w:val="left"/>
+      <w:pPr>
+        <w:tabs>
+          <w:tab w:val="num" w:pos="5040"/>
+        </w:tabs>
+        <w:ind w:left="5040" w:hanging="360"/>
+      </w:pPr>
+      <w:rPr>
+        <w:rFonts w:ascii="Wingdings" w:hAnsi="Wingdings" w:hint="default"/>
+        <w:sz w:val="20"/>
+      </w:rPr>
+    </w:lvl>
+    <w:lvl w:ilvl="7" w:tentative="1">
+      <w:start w:val="1"/>
+      <w:numFmt w:val="bullet"/>
+      <w:lvlText w:val=""/>
+      <w:lvlJc w:val="left"/>
+      <w:pPr>
+        <w:tabs>
+          <w:tab w:val="num" w:pos="5760"/>
+        </w:tabs>
+        <w:ind w:left="5760" w:hanging="360"/>
+      </w:pPr>
+      <w:rPr>
+        <w:rFonts w:ascii="Wingdings" w:hAnsi="Wingdings" w:hint="default"/>
+        <w:sz w:val="20"/>
+      </w:rPr>
+    </w:lvl>
+    <w:lvl w:ilvl="8" w:tentative="1">
+      <w:start w:val="1"/>
+      <w:numFmt w:val="bullet"/>
+      <w:lvlText w:val=""/>
+      <w:lvlJc w:val="left"/>
+      <w:pPr>
+        <w:tabs>
+          <w:tab w:val="num" w:pos="6480"/>
+        </w:tabs>
+        <w:ind w:left="6480" w:hanging="360"/>
+      </w:pPr>
+      <w:rPr>
+        <w:rFonts w:ascii="Wingdings" w:hAnsi="Wingdings" w:hint="default"/>
+        <w:sz w:val="20"/>
+      </w:rPr>
+    </w:lvl>
+  </w:abstractNum>
+  <w:abstractNum w:abstractNumId="27" w15:restartNumberingAfterBreak="0">
     <w:nsid w:val="3AF44FA9"/>
     <w:multiLevelType w:val="multilevel"/>
     <w:tmpl w:val="7D84D77A"/>
@@ -18127,7 +20203,7 @@
       </w:rPr>
     </w:lvl>
   </w:abstractNum>
-  <w:abstractNum w:abstractNumId="22" w15:restartNumberingAfterBreak="0">
+  <w:abstractNum w:abstractNumId="28" w15:restartNumberingAfterBreak="0">
     <w:nsid w:val="3FEB64C9"/>
     <w:multiLevelType w:val="multilevel"/>
     <w:tmpl w:val="9EDE18AA"/>
@@ -18276,7 +20352,7 @@
       </w:rPr>
     </w:lvl>
   </w:abstractNum>
-  <w:abstractNum w:abstractNumId="23" w15:restartNumberingAfterBreak="0">
+  <w:abstractNum w:abstractNumId="29" w15:restartNumberingAfterBreak="0">
     <w:nsid w:val="415354F5"/>
     <w:multiLevelType w:val="multilevel"/>
     <w:tmpl w:val="13E46886"/>
@@ -18425,7 +20501,156 @@
       </w:rPr>
     </w:lvl>
   </w:abstractNum>
-  <w:abstractNum w:abstractNumId="24" w15:restartNumberingAfterBreak="0">
+  <w:abstractNum w:abstractNumId="30" w15:restartNumberingAfterBreak="0">
+    <w:nsid w:val="436777FA"/>
+    <w:multiLevelType w:val="multilevel"/>
+    <w:tmpl w:val="1E1C7A64"/>
+    <w:lvl w:ilvl="0">
+      <w:start w:val="1"/>
+      <w:numFmt w:val="bullet"/>
+      <w:lvlText w:val=""/>
+      <w:lvlJc w:val="left"/>
+      <w:pPr>
+        <w:tabs>
+          <w:tab w:val="num" w:pos="720"/>
+        </w:tabs>
+        <w:ind w:left="720" w:hanging="360"/>
+      </w:pPr>
+      <w:rPr>
+        <w:rFonts w:ascii="Symbol" w:hAnsi="Symbol" w:hint="default"/>
+        <w:sz w:val="20"/>
+      </w:rPr>
+    </w:lvl>
+    <w:lvl w:ilvl="1">
+      <w:start w:val="1"/>
+      <w:numFmt w:val="bullet"/>
+      <w:lvlText w:val="o"/>
+      <w:lvlJc w:val="left"/>
+      <w:pPr>
+        <w:tabs>
+          <w:tab w:val="num" w:pos="1440"/>
+        </w:tabs>
+        <w:ind w:left="1440" w:hanging="360"/>
+      </w:pPr>
+      <w:rPr>
+        <w:rFonts w:ascii="Courier New" w:hAnsi="Courier New" w:hint="default"/>
+        <w:sz w:val="20"/>
+      </w:rPr>
+    </w:lvl>
+    <w:lvl w:ilvl="2" w:tentative="1">
+      <w:start w:val="1"/>
+      <w:numFmt w:val="bullet"/>
+      <w:lvlText w:val=""/>
+      <w:lvlJc w:val="left"/>
+      <w:pPr>
+        <w:tabs>
+          <w:tab w:val="num" w:pos="2160"/>
+        </w:tabs>
+        <w:ind w:left="2160" w:hanging="360"/>
+      </w:pPr>
+      <w:rPr>
+        <w:rFonts w:ascii="Wingdings" w:hAnsi="Wingdings" w:hint="default"/>
+        <w:sz w:val="20"/>
+      </w:rPr>
+    </w:lvl>
+    <w:lvl w:ilvl="3" w:tentative="1">
+      <w:start w:val="1"/>
+      <w:numFmt w:val="bullet"/>
+      <w:lvlText w:val=""/>
+      <w:lvlJc w:val="left"/>
+      <w:pPr>
+        <w:tabs>
+          <w:tab w:val="num" w:pos="2880"/>
+        </w:tabs>
+        <w:ind w:left="2880" w:hanging="360"/>
+      </w:pPr>
+      <w:rPr>
+        <w:rFonts w:ascii="Wingdings" w:hAnsi="Wingdings" w:hint="default"/>
+        <w:sz w:val="20"/>
+      </w:rPr>
+    </w:lvl>
+    <w:lvl w:ilvl="4" w:tentative="1">
+      <w:start w:val="1"/>
+      <w:numFmt w:val="bullet"/>
+      <w:lvlText w:val=""/>
+      <w:lvlJc w:val="left"/>
+      <w:pPr>
+        <w:tabs>
+          <w:tab w:val="num" w:pos="3600"/>
+        </w:tabs>
+        <w:ind w:left="3600" w:hanging="360"/>
+      </w:pPr>
+      <w:rPr>
+        <w:rFonts w:ascii="Wingdings" w:hAnsi="Wingdings" w:hint="default"/>
+        <w:sz w:val="20"/>
+      </w:rPr>
+    </w:lvl>
+    <w:lvl w:ilvl="5" w:tentative="1">
+      <w:start w:val="1"/>
+      <w:numFmt w:val="bullet"/>
+      <w:lvlText w:val=""/>
+      <w:lvlJc w:val="left"/>
+      <w:pPr>
+        <w:tabs>
+          <w:tab w:val="num" w:pos="4320"/>
+        </w:tabs>
+        <w:ind w:left="4320" w:hanging="360"/>
+      </w:pPr>
+      <w:rPr>
+        <w:rFonts w:ascii="Wingdings" w:hAnsi="Wingdings" w:hint="default"/>
+        <w:sz w:val="20"/>
+      </w:rPr>
+    </w:lvl>
+    <w:lvl w:ilvl="6" w:tentative="1">
+      <w:start w:val="1"/>
+      <w:numFmt w:val="bullet"/>
+      <w:lvlText w:val=""/>
+      <w:lvlJc w:val="left"/>
+      <w:pPr>
+        <w:tabs>
+          <w:tab w:val="num" w:pos="5040"/>
+        </w:tabs>
+        <w:ind w:left="5040" w:hanging="360"/>
+      </w:pPr>
+      <w:rPr>
+        <w:rFonts w:ascii="Wingdings" w:hAnsi="Wingdings" w:hint="default"/>
+        <w:sz w:val="20"/>
+      </w:rPr>
+    </w:lvl>
+    <w:lvl w:ilvl="7" w:tentative="1">
+      <w:start w:val="1"/>
+      <w:numFmt w:val="bullet"/>
+      <w:lvlText w:val=""/>
+      <w:lvlJc w:val="left"/>
+      <w:pPr>
+        <w:tabs>
+          <w:tab w:val="num" w:pos="5760"/>
+        </w:tabs>
+        <w:ind w:left="5760" w:hanging="360"/>
+      </w:pPr>
+      <w:rPr>
+        <w:rFonts w:ascii="Wingdings" w:hAnsi="Wingdings" w:hint="default"/>
+        <w:sz w:val="20"/>
+      </w:rPr>
+    </w:lvl>
+    <w:lvl w:ilvl="8" w:tentative="1">
+      <w:start w:val="1"/>
+      <w:numFmt w:val="bullet"/>
+      <w:lvlText w:val=""/>
+      <w:lvlJc w:val="left"/>
+      <w:pPr>
+        <w:tabs>
+          <w:tab w:val="num" w:pos="6480"/>
+        </w:tabs>
+        <w:ind w:left="6480" w:hanging="360"/>
+      </w:pPr>
+      <w:rPr>
+        <w:rFonts w:ascii="Wingdings" w:hAnsi="Wingdings" w:hint="default"/>
+        <w:sz w:val="20"/>
+      </w:rPr>
+    </w:lvl>
+  </w:abstractNum>
+  <w:abstractNum w:abstractNumId="31" w15:restartNumberingAfterBreak="0">
     <w:nsid w:val="4625359D"/>
     <w:multiLevelType w:val="multilevel"/>
     <w:tmpl w:val="28F6D8EE"/>
@@ -18574,7 +20799,7 @@
       </w:rPr>
     </w:lvl>
   </w:abstractNum>
-  <w:abstractNum w:abstractNumId="25" w15:restartNumberingAfterBreak="0">
+  <w:abstractNum w:abstractNumId="32" w15:restartNumberingAfterBreak="0">
     <w:nsid w:val="4C7E31D9"/>
     <w:multiLevelType w:val="multilevel"/>
     <w:tmpl w:val="DEACF4A6"/>
@@ -18723,7 +20948,7 @@
       </w:rPr>
     </w:lvl>
   </w:abstractNum>
-  <w:abstractNum w:abstractNumId="26" w15:restartNumberingAfterBreak="0">
+  <w:abstractNum w:abstractNumId="33" w15:restartNumberingAfterBreak="0">
     <w:nsid w:val="5D4E3A90"/>
     <w:multiLevelType w:val="multilevel"/>
     <w:tmpl w:val="DEACF4A6"/>
@@ -18872,7 +21097,7 @@
       </w:rPr>
     </w:lvl>
   </w:abstractNum>
-  <w:abstractNum w:abstractNumId="27" w15:restartNumberingAfterBreak="0">
+  <w:abstractNum w:abstractNumId="34" w15:restartNumberingAfterBreak="0">
     <w:nsid w:val="5E0D6133"/>
     <w:multiLevelType w:val="multilevel"/>
     <w:tmpl w:val="56DEFE30"/>
@@ -19021,7 +21246,7 @@
       </w:rPr>
     </w:lvl>
   </w:abstractNum>
-  <w:abstractNum w:abstractNumId="28" w15:restartNumberingAfterBreak="0">
+  <w:abstractNum w:abstractNumId="35" w15:restartNumberingAfterBreak="0">
     <w:nsid w:val="5EF06885"/>
     <w:multiLevelType w:val="multilevel"/>
     <w:tmpl w:val="DEACF4A6"/>
@@ -19166,7 +21391,7 @@
       </w:rPr>
     </w:lvl>
   </w:abstractNum>
-  <w:abstractNum w:abstractNumId="29" w15:restartNumberingAfterBreak="0">
+  <w:abstractNum w:abstractNumId="36" w15:restartNumberingAfterBreak="0">
     <w:nsid w:val="606429B3"/>
     <w:multiLevelType w:val="multilevel"/>
     <w:tmpl w:val="DEACF4A6"/>
@@ -19315,7 +21540,7 @@
       </w:rPr>
     </w:lvl>
   </w:abstractNum>
-  <w:abstractNum w:abstractNumId="30" w15:restartNumberingAfterBreak="0">
+  <w:abstractNum w:abstractNumId="37" w15:restartNumberingAfterBreak="0">
     <w:nsid w:val="637003D0"/>
     <w:multiLevelType w:val="multilevel"/>
     <w:tmpl w:val="09320DD6"/>
@@ -19464,7 +21689,156 @@
       </w:rPr>
     </w:lvl>
   </w:abstractNum>
-  <w:abstractNum w:abstractNumId="31" w15:restartNumberingAfterBreak="0">
+  <w:abstractNum w:abstractNumId="38" w15:restartNumberingAfterBreak="0">
+    <w:nsid w:val="679D2DCD"/>
+    <w:multiLevelType w:val="multilevel"/>
+    <w:tmpl w:val="A5A2C868"/>
+    <w:lvl w:ilvl="0">
+      <w:start w:val="1"/>
+      <w:numFmt w:val="bullet"/>
+      <w:lvlText w:val=""/>
+      <w:lvlJc w:val="left"/>
+      <w:pPr>
+        <w:tabs>
+          <w:tab w:val="num" w:pos="720"/>
+        </w:tabs>
+        <w:ind w:left="720" w:hanging="360"/>
+      </w:pPr>
+      <w:rPr>
+        <w:rFonts w:ascii="Symbol" w:hAnsi="Symbol" w:hint="default"/>
+        <w:sz w:val="20"/>
+      </w:rPr>
+    </w:lvl>
+    <w:lvl w:ilvl="1" w:tentative="1">
+      <w:start w:val="1"/>
+      <w:numFmt w:val="bullet"/>
+      <w:lvlText w:val="o"/>
+      <w:lvlJc w:val="left"/>
+      <w:pPr>
+        <w:tabs>
+          <w:tab w:val="num" w:pos="1440"/>
+        </w:tabs>
+        <w:ind w:left="1440" w:hanging="360"/>
+      </w:pPr>
+      <w:rPr>
+        <w:rFonts w:ascii="Courier New" w:hAnsi="Courier New" w:hint="default"/>
+        <w:sz w:val="20"/>
+      </w:rPr>
+    </w:lvl>
+    <w:lvl w:ilvl="2" w:tentative="1">
+      <w:start w:val="1"/>
+      <w:numFmt w:val="bullet"/>
+      <w:lvlText w:val=""/>
+      <w:lvlJc w:val="left"/>
+      <w:pPr>
+        <w:tabs>
+          <w:tab w:val="num" w:pos="2160"/>
+        </w:tabs>
+        <w:ind w:left="2160" w:hanging="360"/>
+      </w:pPr>
+      <w:rPr>
+        <w:rFonts w:ascii="Wingdings" w:hAnsi="Wingdings" w:hint="default"/>
+        <w:sz w:val="20"/>
+      </w:rPr>
+    </w:lvl>
+    <w:lvl w:ilvl="3" w:tentative="1">
+      <w:start w:val="1"/>
+      <w:numFmt w:val="bullet"/>
+      <w:lvlText w:val=""/>
+      <w:lvlJc w:val="left"/>
+      <w:pPr>
+        <w:tabs>
+          <w:tab w:val="num" w:pos="2880"/>
+        </w:tabs>
+        <w:ind w:left="2880" w:hanging="360"/>
+      </w:pPr>
+      <w:rPr>
+        <w:rFonts w:ascii="Wingdings" w:hAnsi="Wingdings" w:hint="default"/>
+        <w:sz w:val="20"/>
+      </w:rPr>
+    </w:lvl>
+    <w:lvl w:ilvl="4" w:tentative="1">
+      <w:start w:val="1"/>
+      <w:numFmt w:val="bullet"/>
+      <w:lvlText w:val=""/>
+      <w:lvlJc w:val="left"/>
+      <w:pPr>
+        <w:tabs>
+          <w:tab w:val="num" w:pos="3600"/>
+        </w:tabs>
+        <w:ind w:left="3600" w:hanging="360"/>
+      </w:pPr>
+      <w:rPr>
+        <w:rFonts w:ascii="Wingdings" w:hAnsi="Wingdings" w:hint="default"/>
+        <w:sz w:val="20"/>
+      </w:rPr>
+    </w:lvl>
+    <w:lvl w:ilvl="5" w:tentative="1">
+      <w:start w:val="1"/>
+      <w:numFmt w:val="bullet"/>
+      <w:lvlText w:val=""/>
+      <w:lvlJc w:val="left"/>
+      <w:pPr>
+        <w:tabs>
+          <w:tab w:val="num" w:pos="4320"/>
+        </w:tabs>
+        <w:ind w:left="4320" w:hanging="360"/>
+      </w:pPr>
+      <w:rPr>
+        <w:rFonts w:ascii="Wingdings" w:hAnsi="Wingdings" w:hint="default"/>
+        <w:sz w:val="20"/>
+      </w:rPr>
+    </w:lvl>
+    <w:lvl w:ilvl="6" w:tentative="1">
+      <w:start w:val="1"/>
+      <w:numFmt w:val="bullet"/>
+      <w:lvlText w:val=""/>
+      <w:lvlJc w:val="left"/>
+      <w:pPr>
+        <w:tabs>
+          <w:tab w:val="num" w:pos="5040"/>
+        </w:tabs>
+        <w:ind w:left="5040" w:hanging="360"/>
+      </w:pPr>
+      <w:rPr>
+        <w:rFonts w:ascii="Wingdings" w:hAnsi="Wingdings" w:hint="default"/>
+        <w:sz w:val="20"/>
+      </w:rPr>
+    </w:lvl>
+    <w:lvl w:ilvl="7" w:tentative="1">
+      <w:start w:val="1"/>
+      <w:numFmt w:val="bullet"/>
+      <w:lvlText w:val=""/>
+      <w:lvlJc w:val="left"/>
+      <w:pPr>
+        <w:tabs>
+          <w:tab w:val="num" w:pos="5760"/>
+        </w:tabs>
+        <w:ind w:left="5760" w:hanging="360"/>
+      </w:pPr>
+      <w:rPr>
+        <w:rFonts w:ascii="Wingdings" w:hAnsi="Wingdings" w:hint="default"/>
+        <w:sz w:val="20"/>
+      </w:rPr>
+    </w:lvl>
+    <w:lvl w:ilvl="8" w:tentative="1">
+      <w:start w:val="1"/>
+      <w:numFmt w:val="bullet"/>
+      <w:lvlText w:val=""/>
+      <w:lvlJc w:val="left"/>
+      <w:pPr>
+        <w:tabs>
+          <w:tab w:val="num" w:pos="6480"/>
+        </w:tabs>
+        <w:ind w:left="6480" w:hanging="360"/>
+      </w:pPr>
+      <w:rPr>
+        <w:rFonts w:ascii="Wingdings" w:hAnsi="Wingdings" w:hint="default"/>
+        <w:sz w:val="20"/>
+      </w:rPr>
+    </w:lvl>
+  </w:abstractNum>
+  <w:abstractNum w:abstractNumId="39" w15:restartNumberingAfterBreak="0">
     <w:nsid w:val="68E67C07"/>
     <w:multiLevelType w:val="multilevel"/>
     <w:tmpl w:val="DEACF4A6"/>
@@ -19613,7 +21987,7 @@
       </w:rPr>
     </w:lvl>
   </w:abstractNum>
-  <w:abstractNum w:abstractNumId="32" w15:restartNumberingAfterBreak="0">
+  <w:abstractNum w:abstractNumId="40" w15:restartNumberingAfterBreak="0">
     <w:nsid w:val="6FA433E4"/>
     <w:multiLevelType w:val="multilevel"/>
     <w:tmpl w:val="013CC30A"/>
@@ -19762,7 +22136,7 @@
       </w:rPr>
     </w:lvl>
   </w:abstractNum>
-  <w:abstractNum w:abstractNumId="33" w15:restartNumberingAfterBreak="0">
+  <w:abstractNum w:abstractNumId="41" w15:restartNumberingAfterBreak="0">
     <w:nsid w:val="6FB30415"/>
     <w:multiLevelType w:val="multilevel"/>
     <w:tmpl w:val="7A9E93A4"/>
@@ -19911,7 +22285,7 @@
       </w:rPr>
     </w:lvl>
   </w:abstractNum>
-  <w:abstractNum w:abstractNumId="34" w15:restartNumberingAfterBreak="0">
+  <w:abstractNum w:abstractNumId="42" w15:restartNumberingAfterBreak="0">
     <w:nsid w:val="735A0926"/>
     <w:multiLevelType w:val="multilevel"/>
     <w:tmpl w:val="51FCB4C4"/>
@@ -20060,7 +22434,7 @@
       </w:rPr>
     </w:lvl>
   </w:abstractNum>
-  <w:abstractNum w:abstractNumId="35" w15:restartNumberingAfterBreak="0">
+  <w:abstractNum w:abstractNumId="43" w15:restartNumberingAfterBreak="0">
     <w:nsid w:val="76C373DB"/>
     <w:multiLevelType w:val="multilevel"/>
     <w:tmpl w:val="DCA672A8"/>
@@ -20209,7 +22583,7 @@
       </w:rPr>
     </w:lvl>
   </w:abstractNum>
-  <w:abstractNum w:abstractNumId="36" w15:restartNumberingAfterBreak="0">
+  <w:abstractNum w:abstractNumId="44" w15:restartNumberingAfterBreak="0">
     <w:nsid w:val="77AF4AE5"/>
     <w:multiLevelType w:val="multilevel"/>
     <w:tmpl w:val="DEACF4A6"/>
@@ -20358,7 +22732,156 @@
       </w:rPr>
     </w:lvl>
   </w:abstractNum>
-  <w:abstractNum w:abstractNumId="37" w15:restartNumberingAfterBreak="0">
+  <w:abstractNum w:abstractNumId="45" w15:restartNumberingAfterBreak="0">
+    <w:nsid w:val="77F550E6"/>
+    <w:multiLevelType w:val="multilevel"/>
+    <w:tmpl w:val="880242FC"/>
+    <w:lvl w:ilvl="0">
+      <w:start w:val="1"/>
+      <w:numFmt w:val="bullet"/>
+      <w:lvlText w:val=""/>
+      <w:lvlJc w:val="left"/>
+      <w:pPr>
+        <w:tabs>
+          <w:tab w:val="num" w:pos="720"/>
+        </w:tabs>
+        <w:ind w:left="720" w:hanging="360"/>
+      </w:pPr>
+      <w:rPr>
+        <w:rFonts w:ascii="Symbol" w:hAnsi="Symbol" w:hint="default"/>
+        <w:sz w:val="20"/>
+      </w:rPr>
+    </w:lvl>
+    <w:lvl w:ilvl="1" w:tentative="1">
+      <w:start w:val="1"/>
+      <w:numFmt w:val="bullet"/>
+      <w:lvlText w:val="o"/>
+      <w:lvlJc w:val="left"/>
+      <w:pPr>
+        <w:tabs>
+          <w:tab w:val="num" w:pos="1440"/>
+        </w:tabs>
+        <w:ind w:left="1440" w:hanging="360"/>
+      </w:pPr>
+      <w:rPr>
+        <w:rFonts w:ascii="Courier New" w:hAnsi="Courier New" w:hint="default"/>
+        <w:sz w:val="20"/>
+      </w:rPr>
+    </w:lvl>
+    <w:lvl w:ilvl="2" w:tentative="1">
+      <w:start w:val="1"/>
+      <w:numFmt w:val="bullet"/>
+      <w:lvlText w:val=""/>
+      <w:lvlJc w:val="left"/>
+      <w:pPr>
+        <w:tabs>
+          <w:tab w:val="num" w:pos="2160"/>
+        </w:tabs>
+        <w:ind w:left="2160" w:hanging="360"/>
+      </w:pPr>
+      <w:rPr>
+        <w:rFonts w:ascii="Wingdings" w:hAnsi="Wingdings" w:hint="default"/>
+        <w:sz w:val="20"/>
+      </w:rPr>
+    </w:lvl>
+    <w:lvl w:ilvl="3" w:tentative="1">
+      <w:start w:val="1"/>
+      <w:numFmt w:val="bullet"/>
+      <w:lvlText w:val=""/>
+      <w:lvlJc w:val="left"/>
+      <w:pPr>
+        <w:tabs>
+          <w:tab w:val="num" w:pos="2880"/>
+        </w:tabs>
+        <w:ind w:left="2880" w:hanging="360"/>
+      </w:pPr>
+      <w:rPr>
+        <w:rFonts w:ascii="Wingdings" w:hAnsi="Wingdings" w:hint="default"/>
+        <w:sz w:val="20"/>
+      </w:rPr>
+    </w:lvl>
+    <w:lvl w:ilvl="4" w:tentative="1">
+      <w:start w:val="1"/>
+      <w:numFmt w:val="bullet"/>
+      <w:lvlText w:val=""/>
+      <w:lvlJc w:val="left"/>
+      <w:pPr>
+        <w:tabs>
+          <w:tab w:val="num" w:pos="3600"/>
+        </w:tabs>
+        <w:ind w:left="3600" w:hanging="360"/>
+      </w:pPr>
+      <w:rPr>
+        <w:rFonts w:ascii="Wingdings" w:hAnsi="Wingdings" w:hint="default"/>
+        <w:sz w:val="20"/>
+      </w:rPr>
+    </w:lvl>
+    <w:lvl w:ilvl="5" w:tentative="1">
+      <w:start w:val="1"/>
+      <w:numFmt w:val="bullet"/>
+      <w:lvlText w:val=""/>
+      <w:lvlJc w:val="left"/>
+      <w:pPr>
+        <w:tabs>
+          <w:tab w:val="num" w:pos="4320"/>
+        </w:tabs>
+        <w:ind w:left="4320" w:hanging="360"/>
+      </w:pPr>
+      <w:rPr>
+        <w:rFonts w:ascii="Wingdings" w:hAnsi="Wingdings" w:hint="default"/>
+        <w:sz w:val="20"/>
+      </w:rPr>
+    </w:lvl>
+    <w:lvl w:ilvl="6" w:tentative="1">
+      <w:start w:val="1"/>
+      <w:numFmt w:val="bullet"/>
+      <w:lvlText w:val=""/>
+      <w:lvlJc w:val="left"/>
+      <w:pPr>
+        <w:tabs>
+          <w:tab w:val="num" w:pos="5040"/>
+        </w:tabs>
+        <w:ind w:left="5040" w:hanging="360"/>
+      </w:pPr>
+      <w:rPr>
+        <w:rFonts w:ascii="Wingdings" w:hAnsi="Wingdings" w:hint="default"/>
+        <w:sz w:val="20"/>
+      </w:rPr>
+    </w:lvl>
+    <w:lvl w:ilvl="7" w:tentative="1">
+      <w:start w:val="1"/>
+      <w:numFmt w:val="bullet"/>
+      <w:lvlText w:val=""/>
+      <w:lvlJc w:val="left"/>
+      <w:pPr>
+        <w:tabs>
+          <w:tab w:val="num" w:pos="5760"/>
+        </w:tabs>
+        <w:ind w:left="5760" w:hanging="360"/>
+      </w:pPr>
+      <w:rPr>
+        <w:rFonts w:ascii="Wingdings" w:hAnsi="Wingdings" w:hint="default"/>
+        <w:sz w:val="20"/>
+      </w:rPr>
+    </w:lvl>
+    <w:lvl w:ilvl="8" w:tentative="1">
+      <w:start w:val="1"/>
+      <w:numFmt w:val="bullet"/>
+      <w:lvlText w:val=""/>
+      <w:lvlJc w:val="left"/>
+      <w:pPr>
+        <w:tabs>
+          <w:tab w:val="num" w:pos="6480"/>
+        </w:tabs>
+        <w:ind w:left="6480" w:hanging="360"/>
+      </w:pPr>
+      <w:rPr>
+        <w:rFonts w:ascii="Wingdings" w:hAnsi="Wingdings" w:hint="default"/>
+        <w:sz w:val="20"/>
+      </w:rPr>
+    </w:lvl>
+  </w:abstractNum>
+  <w:abstractNum w:abstractNumId="46" w15:restartNumberingAfterBreak="0">
     <w:nsid w:val="77F702AC"/>
     <w:multiLevelType w:val="multilevel"/>
     <w:tmpl w:val="3E98B150"/>
@@ -20507,7 +23030,7 @@
       </w:rPr>
     </w:lvl>
   </w:abstractNum>
-  <w:abstractNum w:abstractNumId="38" w15:restartNumberingAfterBreak="0">
+  <w:abstractNum w:abstractNumId="47" w15:restartNumberingAfterBreak="0">
     <w:nsid w:val="7A72333D"/>
     <w:multiLevelType w:val="multilevel"/>
     <w:tmpl w:val="DDF812BE"/>
@@ -20657,58 +23180,58 @@
     </w:lvl>
   </w:abstractNum>
   <w:num w:numId="1" w16cid:durableId="1111439828">
-    <w:abstractNumId w:val="1"/>
+    <w:abstractNumId w:val="2"/>
   </w:num>
   <w:num w:numId="2" w16cid:durableId="812017061">
-    <w:abstractNumId w:val="34"/>
+    <w:abstractNumId w:val="42"/>
   </w:num>
   <w:num w:numId="3" w16cid:durableId="1938445282">
+    <w:abstractNumId w:val="11"/>
+  </w:num>
+  <w:num w:numId="4" w16cid:durableId="1285187072">
+    <w:abstractNumId w:val="46"/>
+  </w:num>
+  <w:num w:numId="5" w16cid:durableId="2122995575">
+    <w:abstractNumId w:val="12"/>
+  </w:num>
+  <w:num w:numId="6" w16cid:durableId="2058508045">
+    <w:abstractNumId w:val="13"/>
+  </w:num>
+  <w:num w:numId="7" w16cid:durableId="672535709">
+    <w:abstractNumId w:val="19"/>
+  </w:num>
+  <w:num w:numId="8" w16cid:durableId="1745294010">
+    <w:abstractNumId w:val="43"/>
+  </w:num>
+  <w:num w:numId="9" w16cid:durableId="1252930702">
+    <w:abstractNumId w:val="7"/>
+  </w:num>
+  <w:num w:numId="10" w16cid:durableId="698318159">
+    <w:abstractNumId w:val="47"/>
+  </w:num>
+  <w:num w:numId="11" w16cid:durableId="1981767801">
+    <w:abstractNumId w:val="27"/>
+  </w:num>
+  <w:num w:numId="12" w16cid:durableId="2025396777">
+    <w:abstractNumId w:val="15"/>
+  </w:num>
+  <w:num w:numId="13" w16cid:durableId="832571625">
+    <w:abstractNumId w:val="20"/>
+  </w:num>
+  <w:num w:numId="14" w16cid:durableId="1683126446">
+    <w:abstractNumId w:val="40"/>
+  </w:num>
+  <w:num w:numId="15" w16cid:durableId="1450396647">
+    <w:abstractNumId w:val="36"/>
+  </w:num>
+  <w:num w:numId="16" w16cid:durableId="1599484692">
+    <w:abstractNumId w:val="37"/>
+  </w:num>
+  <w:num w:numId="17" w16cid:durableId="1326317591">
     <w:abstractNumId w:val="9"/>
   </w:num>
-  <w:num w:numId="4" w16cid:durableId="1285187072">
-    <w:abstractNumId w:val="37"/>
-  </w:num>
-  <w:num w:numId="5" w16cid:durableId="2122995575">
-    <w:abstractNumId w:val="10"/>
-  </w:num>
-  <w:num w:numId="6" w16cid:durableId="2058508045">
-    <w:abstractNumId w:val="11"/>
-  </w:num>
-  <w:num w:numId="7" w16cid:durableId="672535709">
-    <w:abstractNumId w:val="16"/>
-  </w:num>
-  <w:num w:numId="8" w16cid:durableId="1745294010">
-    <w:abstractNumId w:val="35"/>
-  </w:num>
-  <w:num w:numId="9" w16cid:durableId="1252930702">
-    <w:abstractNumId w:val="5"/>
-  </w:num>
-  <w:num w:numId="10" w16cid:durableId="698318159">
-    <w:abstractNumId w:val="38"/>
-  </w:num>
-  <w:num w:numId="11" w16cid:durableId="1981767801">
-    <w:abstractNumId w:val="21"/>
-  </w:num>
-  <w:num w:numId="12" w16cid:durableId="2025396777">
-    <w:abstractNumId w:val="13"/>
-  </w:num>
-  <w:num w:numId="13" w16cid:durableId="832571625">
-    <w:abstractNumId w:val="17"/>
-  </w:num>
-  <w:num w:numId="14" w16cid:durableId="1683126446">
-    <w:abstractNumId w:val="32"/>
-  </w:num>
-  <w:num w:numId="15" w16cid:durableId="1450396647">
-    <w:abstractNumId w:val="29"/>
-  </w:num>
-  <w:num w:numId="16" w16cid:durableId="1599484692">
-    <w:abstractNumId w:val="30"/>
-  </w:num>
-  <w:num w:numId="17" w16cid:durableId="1326317591">
-    <w:abstractNumId w:val="7"/>
-  </w:num>
   <w:num w:numId="18" w16cid:durableId="2029676178">
-    <w:abstractNumId w:val="7"/>
+    <w:abstractNumId w:val="9"/>
     <w:lvlOverride w:ilvl="1">
       <w:lvl w:ilvl="1">
         <w:numFmt w:val="bullet"/>
@@ -20728,43 +23251,43 @@
     </w:lvlOverride>
   </w:num>
   <w:num w:numId="19" w16cid:durableId="1183939421">
-    <w:abstractNumId w:val="20"/>
+    <w:abstractNumId w:val="25"/>
   </w:num>
   <w:num w:numId="20" w16cid:durableId="284655544">
-    <w:abstractNumId w:val="25"/>
+    <w:abstractNumId w:val="32"/>
   </w:num>
   <w:num w:numId="21" w16cid:durableId="1502156267">
-    <w:abstractNumId w:val="14"/>
+    <w:abstractNumId w:val="16"/>
   </w:num>
   <w:num w:numId="22" w16cid:durableId="470556998">
-    <w:abstractNumId w:val="28"/>
+    <w:abstractNumId w:val="35"/>
   </w:num>
   <w:num w:numId="23" w16cid:durableId="705911843">
-    <w:abstractNumId w:val="6"/>
+    <w:abstractNumId w:val="8"/>
   </w:num>
   <w:num w:numId="24" w16cid:durableId="161898721">
-    <w:abstractNumId w:val="18"/>
+    <w:abstractNumId w:val="21"/>
   </w:num>
   <w:num w:numId="25" w16cid:durableId="373310421">
-    <w:abstractNumId w:val="4"/>
+    <w:abstractNumId w:val="5"/>
   </w:num>
   <w:num w:numId="26" w16cid:durableId="1050691209">
     <w:abstractNumId w:val="0"/>
   </w:num>
   <w:num w:numId="27" w16cid:durableId="67508778">
-    <w:abstractNumId w:val="8"/>
+    <w:abstractNumId w:val="10"/>
   </w:num>
   <w:num w:numId="28" w16cid:durableId="1395159809">
-    <w:abstractNumId w:val="15"/>
+    <w:abstractNumId w:val="17"/>
   </w:num>
   <w:num w:numId="29" w16cid:durableId="1609846555">
-    <w:abstractNumId w:val="19"/>
+    <w:abstractNumId w:val="23"/>
   </w:num>
   <w:num w:numId="30" w16cid:durableId="1615557612">
-    <w:abstractNumId w:val="36"/>
+    <w:abstractNumId w:val="44"/>
   </w:num>
   <w:num w:numId="31" w16cid:durableId="2003002973">
-    <w:abstractNumId w:val="36"/>
+    <w:abstractNumId w:val="44"/>
     <w:lvlOverride w:ilvl="1">
       <w:lvl w:ilvl="1">
         <w:numFmt w:val="decimal"/>
@@ -20774,34 +23297,61 @@
     </w:lvlOverride>
   </w:num>
   <w:num w:numId="32" w16cid:durableId="1585794988">
-    <w:abstractNumId w:val="2"/>
+    <w:abstractNumId w:val="3"/>
   </w:num>
   <w:num w:numId="33" w16cid:durableId="816841435">
+    <w:abstractNumId w:val="39"/>
+  </w:num>
+  <w:num w:numId="34" w16cid:durableId="1067143143">
+    <w:abstractNumId w:val="33"/>
+  </w:num>
+  <w:num w:numId="35" w16cid:durableId="1289777252">
+    <w:abstractNumId w:val="28"/>
+  </w:num>
+  <w:num w:numId="36" w16cid:durableId="1449423815">
+    <w:abstractNumId w:val="4"/>
+  </w:num>
+  <w:num w:numId="37" w16cid:durableId="1226530235">
+    <w:abstractNumId w:val="41"/>
+  </w:num>
+  <w:num w:numId="38" w16cid:durableId="1516187492">
+    <w:abstractNumId w:val="14"/>
+  </w:num>
+  <w:num w:numId="39" w16cid:durableId="645208804">
+    <w:abstractNumId w:val="29"/>
+  </w:num>
+  <w:num w:numId="40" w16cid:durableId="1559853496">
     <w:abstractNumId w:val="31"/>
   </w:num>
-  <w:num w:numId="34" w16cid:durableId="1067143143">
+  <w:num w:numId="41" w16cid:durableId="184752942">
+    <w:abstractNumId w:val="34"/>
+  </w:num>
+  <w:num w:numId="42" w16cid:durableId="94257267">
     <w:abstractNumId w:val="26"/>
   </w:num>
-  <w:num w:numId="35" w16cid:durableId="1289777252">
+  <w:num w:numId="43" w16cid:durableId="134373823">
+    <w:abstractNumId w:val="45"/>
+  </w:num>
+  <w:num w:numId="44" w16cid:durableId="2073042897">
+    <w:abstractNumId w:val="24"/>
+  </w:num>
+  <w:num w:numId="45" w16cid:durableId="1968046307">
+    <w:abstractNumId w:val="30"/>
+  </w:num>
+  <w:num w:numId="46" w16cid:durableId="571621816">
     <w:abstractNumId w:val="22"/>
   </w:num>
-  <w:num w:numId="36" w16cid:durableId="1449423815">
-    <w:abstractNumId w:val="3"/>
+  <w:num w:numId="47" w16cid:durableId="2111731710">
+    <w:abstractNumId w:val="38"/>
   </w:num>
-  <w:num w:numId="37" w16cid:durableId="1226530235">
-    <w:abstractNumId w:val="33"/>
+  <w:num w:numId="48" w16cid:durableId="1863784109">
+    <w:abstractNumId w:val="6"/>
   </w:num>
-  <w:num w:numId="38" w16cid:durableId="1516187492">
-    <w:abstractNumId w:val="12"/>
+  <w:num w:numId="49" w16cid:durableId="1621300608">
+    <w:abstractNumId w:val="18"/>
   </w:num>
-  <w:num w:numId="39" w16cid:durableId="645208804">
-    <w:abstractNumId w:val="23"/>
-  </w:num>
-  <w:num w:numId="40" w16cid:durableId="1559853496">
-    <w:abstractNumId w:val="24"/>
-  </w:num>
-  <w:num w:numId="41" w16cid:durableId="184752942">
-    <w:abstractNumId w:val="27"/>
+  <w:num w:numId="50" w16cid:durableId="519468172">
+    <w:abstractNumId w:val="1"/>
   </w:num>
 </w:numbering>
 </file>
@@ -21205,7 +23755,10 @@
   <w:style w:type="paragraph" w:default="1" w:styleId="Normal">
     <w:name w:val="Normal"/>
     <w:qFormat/>
-    <w:rsid w:val="00851F2A"/>
+    <w:rsid w:val="00D34693"/>
+    <w:rPr>
+      <w:noProof/>
+    </w:rPr>
   </w:style>
   <w:style w:type="paragraph" w:styleId="Heading1">
     <w:name w:val="heading 1"/>
@@ -21613,7 +24166,7 @@
     <w:basedOn w:val="Normal"/>
     <w:autoRedefine/>
     <w:qFormat/>
-    <w:rsid w:val="002E6045"/>
+    <w:rsid w:val="00D34693"/>
     <w:pPr>
       <w:numPr>
         <w:numId w:val="38"/>
@@ -21624,9 +24177,10 @@
     </w:pPr>
     <w:rPr>
       <w:rFonts w:ascii="Courier New" w:hAnsi="Courier New" w:cs="Courier New"/>
+      <w:b/>
       <w:bCs/>
-      <w:noProof/>
-      <w:sz w:val="20"/>
+      <w:color w:val="00B050"/>
+      <w:sz w:val="22"/>
       <w:szCs w:val="20"/>
     </w:rPr>
   </w:style>

</xml_diff>

<commit_message>
Moving averages on algorithm
</commit_message>
<xml_diff>
--- a/introduction to machine learning.docx
+++ b/introduction to machine learning.docx
@@ -13806,7 +13806,7 @@
           <w:bCs/>
         </w:rPr>
         <w:pict w14:anchorId="1C84EC75">
-          <v:rect id="_x0000_i1110" style="width:0;height:1.5pt" o:hralign="center" o:hrstd="t" o:hr="t" fillcolor="#a0a0a0" stroked="f"/>
+          <v:rect id="_x0000_i1068" style="width:0;height:1.5pt" o:hralign="center" o:hrstd="t" o:hr="t" fillcolor="#a0a0a0" stroked="f"/>
         </w:pict>
       </w:r>
     </w:p>
@@ -13919,7 +13919,7 @@
           <w:bCs/>
         </w:rPr>
         <w:pict w14:anchorId="327006F7">
-          <v:rect id="_x0000_i1111" style="width:0;height:1.5pt" o:hralign="center" o:hrstd="t" o:hr="t" fillcolor="#a0a0a0" stroked="f"/>
+          <v:rect id="_x0000_i1069" style="width:0;height:1.5pt" o:hralign="center" o:hrstd="t" o:hr="t" fillcolor="#a0a0a0" stroked="f"/>
         </w:pict>
       </w:r>
     </w:p>
@@ -14256,7 +14256,7 @@
           <w:bCs/>
         </w:rPr>
         <w:pict w14:anchorId="0EC80FFE">
-          <v:rect id="_x0000_i1112" style="width:0;height:1.5pt" o:hralign="center" o:hrstd="t" o:hr="t" fillcolor="#a0a0a0" stroked="f"/>
+          <v:rect id="_x0000_i1070" style="width:0;height:1.5pt" o:hralign="center" o:hrstd="t" o:hr="t" fillcolor="#a0a0a0" stroked="f"/>
         </w:pict>
       </w:r>
     </w:p>
@@ -14337,7 +14337,7 @@
           <w:bCs/>
         </w:rPr>
         <w:pict w14:anchorId="2C1A4A15">
-          <v:rect id="_x0000_i1113" style="width:0;height:1.5pt" o:hralign="center" o:hrstd="t" o:hr="t" fillcolor="#a0a0a0" stroked="f"/>
+          <v:rect id="_x0000_i1071" style="width:0;height:1.5pt" o:hralign="center" o:hrstd="t" o:hr="t" fillcolor="#a0a0a0" stroked="f"/>
         </w:pict>
       </w:r>
     </w:p>
@@ -14504,7 +14504,7 @@
           <w:bCs/>
         </w:rPr>
         <w:pict w14:anchorId="0798D40F">
-          <v:rect id="_x0000_i1114" style="width:0;height:1.5pt" o:hralign="center" o:hrstd="t" o:hr="t" fillcolor="#a0a0a0" stroked="f"/>
+          <v:rect id="_x0000_i1072" style="width:0;height:1.5pt" o:hralign="center" o:hrstd="t" o:hr="t" fillcolor="#a0a0a0" stroked="f"/>
         </w:pict>
       </w:r>
     </w:p>
@@ -15404,7 +15404,7 @@
           <w:bCs/>
         </w:rPr>
         <w:pict w14:anchorId="0D0C016B">
-          <v:rect id="_x0000_i1115" style="width:0;height:1.5pt" o:hralign="center" o:hrstd="t" o:hr="t" fillcolor="#a0a0a0" stroked="f"/>
+          <v:rect id="_x0000_i1073" style="width:0;height:1.5pt" o:hralign="center" o:hrstd="t" o:hr="t" fillcolor="#a0a0a0" stroked="f"/>
         </w:pict>
       </w:r>
     </w:p>
@@ -15857,7 +15857,7 @@
           <w:bCs/>
         </w:rPr>
         <w:pict w14:anchorId="0DC4FDAC">
-          <v:rect id="_x0000_i1179" style="width:0;height:1.5pt" o:hralign="center" o:hrstd="t" o:hr="t" fillcolor="#a0a0a0" stroked="f"/>
+          <v:rect id="_x0000_i1074" style="width:0;height:1.5pt" o:hralign="center" o:hrstd="t" o:hr="t" fillcolor="#a0a0a0" stroked="f"/>
         </w:pict>
       </w:r>
     </w:p>
@@ -16094,7 +16094,7 @@
           <w:bCs/>
         </w:rPr>
         <w:pict w14:anchorId="594460B6">
-          <v:rect id="_x0000_i1180" style="width:0;height:1.5pt" o:hralign="center" o:hrstd="t" o:hr="t" fillcolor="#a0a0a0" stroked="f"/>
+          <v:rect id="_x0000_i1075" style="width:0;height:1.5pt" o:hralign="center" o:hrstd="t" o:hr="t" fillcolor="#a0a0a0" stroked="f"/>
         </w:pict>
       </w:r>
     </w:p>
@@ -16374,7 +16374,7 @@
           <w:bCs/>
         </w:rPr>
         <w:pict w14:anchorId="2F3F0CEC">
-          <v:rect id="_x0000_i1181" style="width:0;height:1.5pt" o:hralign="center" o:hrstd="t" o:hr="t" fillcolor="#a0a0a0" stroked="f"/>
+          <v:rect id="_x0000_i1076" style="width:0;height:1.5pt" o:hralign="center" o:hrstd="t" o:hr="t" fillcolor="#a0a0a0" stroked="f"/>
         </w:pict>
       </w:r>
     </w:p>
@@ -17069,7 +17069,7 @@
           <w:bCs/>
         </w:rPr>
         <w:pict w14:anchorId="07253486">
-          <v:rect id="_x0000_i1203" style="width:0;height:1.5pt" o:hralign="center" o:hrstd="t" o:hr="t" fillcolor="#a0a0a0" stroked="f"/>
+          <v:rect id="_x0000_i1077" style="width:0;height:1.5pt" o:hralign="center" o:hrstd="t" o:hr="t" fillcolor="#a0a0a0" stroked="f"/>
         </w:pict>
       </w:r>
     </w:p>
@@ -17253,7 +17253,7 @@
           <w:bCs/>
         </w:rPr>
         <w:pict w14:anchorId="395CA9AF">
-          <v:rect id="_x0000_i1204" style="width:0;height:1.5pt" o:hralign="center" o:hrstd="t" o:hr="t" fillcolor="#a0a0a0" stroked="f"/>
+          <v:rect id="_x0000_i1078" style="width:0;height:1.5pt" o:hralign="center" o:hrstd="t" o:hr="t" fillcolor="#a0a0a0" stroked="f"/>
         </w:pict>
       </w:r>
     </w:p>
@@ -17408,7 +17408,7 @@
           <w:bCs/>
         </w:rPr>
         <w:pict w14:anchorId="32E67079">
-          <v:rect id="_x0000_i1205" style="width:0;height:1.5pt" o:hralign="center" o:hrstd="t" o:hr="t" fillcolor="#a0a0a0" stroked="f"/>
+          <v:rect id="_x0000_i1079" style="width:0;height:1.5pt" o:hralign="center" o:hrstd="t" o:hr="t" fillcolor="#a0a0a0" stroked="f"/>
         </w:pict>
       </w:r>
     </w:p>
@@ -27814,6 +27814,7 @@
   <w:style w:type="character" w:default="1" w:styleId="DefaultParagraphFont">
     <w:name w:val="Default Paragraph Font"/>
     <w:uiPriority w:val="1"/>
+    <w:semiHidden/>
     <w:unhideWhenUsed/>
   </w:style>
   <w:style w:type="table" w:default="1" w:styleId="TableNormal">
@@ -28118,7 +28119,7 @@
     <w:basedOn w:val="Normal"/>
     <w:autoRedefine/>
     <w:qFormat/>
-    <w:rsid w:val="00D34693"/>
+    <w:rsid w:val="002C11F2"/>
     <w:pPr>
       <w:numPr>
         <w:numId w:val="38"/>
@@ -28131,7 +28132,7 @@
       <w:rFonts w:ascii="Courier New" w:hAnsi="Courier New" w:cs="Courier New"/>
       <w:b/>
       <w:bCs/>
-      <w:color w:val="00B050"/>
+      <w:color w:val="385623" w:themeColor="accent6" w:themeShade="80"/>
       <w:sz w:val="22"/>
       <w:szCs w:val="20"/>
     </w:rPr>

</xml_diff>